<commit_message>
PR 6 and correction
</commit_message>
<xml_diff>
--- a/DBMS/Avdhut Madhavi TU3S2627005 C-60 DBMS EXP1.docx
+++ b/DBMS/Avdhut Madhavi TU3S2627005 C-60 DBMS EXP1.docx
@@ -629,88 +629,168 @@
           <w:szCs w:val="24"/>
           <w:lang w:val="en-IN"/>
         </w:rPr>
-        <w:t xml:space="preserve">    movie_id INT PRIMARY KEY,</w:t>
-      </w:r>
-    </w:p>
-    <w:p>
-      <w:pPr>
-        <w:widowControl/>
-        <w:pBdr>
-          <w:top w:val="nil"/>
-          <w:left w:val="nil"/>
-          <w:bottom w:val="nil"/>
-          <w:right w:val="nil"/>
-          <w:between w:val="nil"/>
-        </w:pBdr>
-        <w:rPr>
-          <w:color w:val="000000"/>
-          <w:sz w:val="24"/>
-          <w:szCs w:val="24"/>
-          <w:lang w:val="en-IN"/>
-        </w:rPr>
-      </w:pPr>
-      <w:r>
-        <w:rPr>
-          <w:color w:val="000000"/>
-          <w:sz w:val="24"/>
-          <w:szCs w:val="24"/>
-          <w:lang w:val="en-IN"/>
-        </w:rPr>
-        <w:t xml:space="preserve">    title VARCHAR(50) NOT NULL,</w:t>
-      </w:r>
-    </w:p>
-    <w:p>
-      <w:pPr>
-        <w:widowControl/>
-        <w:pBdr>
-          <w:top w:val="nil"/>
-          <w:left w:val="nil"/>
-          <w:bottom w:val="nil"/>
-          <w:right w:val="nil"/>
-          <w:between w:val="nil"/>
-        </w:pBdr>
-        <w:rPr>
-          <w:color w:val="000000"/>
-          <w:sz w:val="24"/>
-          <w:szCs w:val="24"/>
-          <w:lang w:val="en-IN"/>
-        </w:rPr>
-      </w:pPr>
-      <w:r>
-        <w:rPr>
-          <w:color w:val="000000"/>
-          <w:sz w:val="24"/>
-          <w:szCs w:val="24"/>
-          <w:lang w:val="en-IN"/>
-        </w:rPr>
-        <w:t xml:space="preserve">    genre VARCHAR(20),</w:t>
-      </w:r>
-    </w:p>
-    <w:p>
-      <w:pPr>
-        <w:widowControl/>
-        <w:pBdr>
-          <w:top w:val="nil"/>
-          <w:left w:val="nil"/>
-          <w:bottom w:val="nil"/>
-          <w:right w:val="nil"/>
-          <w:between w:val="nil"/>
-        </w:pBdr>
-        <w:rPr>
-          <w:color w:val="000000"/>
-          <w:sz w:val="24"/>
-          <w:szCs w:val="24"/>
-          <w:lang w:val="en-IN"/>
-        </w:rPr>
-      </w:pPr>
-      <w:r>
-        <w:rPr>
-          <w:color w:val="000000"/>
-          <w:sz w:val="24"/>
-          <w:szCs w:val="24"/>
-          <w:lang w:val="en-IN"/>
-        </w:rPr>
-        <w:t xml:space="preserve">    language VARCHAR(20),</w:t>
+        <w:t xml:space="preserve">    </w:t>
+      </w:r>
+      <w:proofErr w:type="spellStart"/>
+      <w:r>
+        <w:rPr>
+          <w:color w:val="000000"/>
+          <w:sz w:val="24"/>
+          <w:szCs w:val="24"/>
+          <w:lang w:val="en-IN"/>
+        </w:rPr>
+        <w:t>movie_id</w:t>
+      </w:r>
+      <w:proofErr w:type="spellEnd"/>
+      <w:r>
+        <w:rPr>
+          <w:color w:val="000000"/>
+          <w:sz w:val="24"/>
+          <w:szCs w:val="24"/>
+          <w:lang w:val="en-IN"/>
+        </w:rPr>
+        <w:t xml:space="preserve"> INT PRIMARY KEY,</w:t>
+      </w:r>
+    </w:p>
+    <w:p>
+      <w:pPr>
+        <w:widowControl/>
+        <w:pBdr>
+          <w:top w:val="nil"/>
+          <w:left w:val="nil"/>
+          <w:bottom w:val="nil"/>
+          <w:right w:val="nil"/>
+          <w:between w:val="nil"/>
+        </w:pBdr>
+        <w:rPr>
+          <w:color w:val="000000"/>
+          <w:sz w:val="24"/>
+          <w:szCs w:val="24"/>
+          <w:lang w:val="en-IN"/>
+        </w:rPr>
+      </w:pPr>
+      <w:r>
+        <w:rPr>
+          <w:color w:val="000000"/>
+          <w:sz w:val="24"/>
+          <w:szCs w:val="24"/>
+          <w:lang w:val="en-IN"/>
+        </w:rPr>
+        <w:t xml:space="preserve">    title </w:t>
+      </w:r>
+      <w:proofErr w:type="gramStart"/>
+      <w:r>
+        <w:rPr>
+          <w:color w:val="000000"/>
+          <w:sz w:val="24"/>
+          <w:szCs w:val="24"/>
+          <w:lang w:val="en-IN"/>
+        </w:rPr>
+        <w:t>VARCHAR(</w:t>
+      </w:r>
+      <w:proofErr w:type="gramEnd"/>
+      <w:r>
+        <w:rPr>
+          <w:color w:val="000000"/>
+          <w:sz w:val="24"/>
+          <w:szCs w:val="24"/>
+          <w:lang w:val="en-IN"/>
+        </w:rPr>
+        <w:t>50) NOT NULL,</w:t>
+      </w:r>
+    </w:p>
+    <w:p>
+      <w:pPr>
+        <w:widowControl/>
+        <w:pBdr>
+          <w:top w:val="nil"/>
+          <w:left w:val="nil"/>
+          <w:bottom w:val="nil"/>
+          <w:right w:val="nil"/>
+          <w:between w:val="nil"/>
+        </w:pBdr>
+        <w:rPr>
+          <w:color w:val="000000"/>
+          <w:sz w:val="24"/>
+          <w:szCs w:val="24"/>
+          <w:lang w:val="en-IN"/>
+        </w:rPr>
+      </w:pPr>
+      <w:r>
+        <w:rPr>
+          <w:color w:val="000000"/>
+          <w:sz w:val="24"/>
+          <w:szCs w:val="24"/>
+          <w:lang w:val="en-IN"/>
+        </w:rPr>
+        <w:t xml:space="preserve">    genre </w:t>
+      </w:r>
+      <w:proofErr w:type="gramStart"/>
+      <w:r>
+        <w:rPr>
+          <w:color w:val="000000"/>
+          <w:sz w:val="24"/>
+          <w:szCs w:val="24"/>
+          <w:lang w:val="en-IN"/>
+        </w:rPr>
+        <w:t>VARCHAR(</w:t>
+      </w:r>
+      <w:proofErr w:type="gramEnd"/>
+      <w:r>
+        <w:rPr>
+          <w:color w:val="000000"/>
+          <w:sz w:val="24"/>
+          <w:szCs w:val="24"/>
+          <w:lang w:val="en-IN"/>
+        </w:rPr>
+        <w:t>20),</w:t>
+      </w:r>
+    </w:p>
+    <w:p>
+      <w:pPr>
+        <w:widowControl/>
+        <w:pBdr>
+          <w:top w:val="nil"/>
+          <w:left w:val="nil"/>
+          <w:bottom w:val="nil"/>
+          <w:right w:val="nil"/>
+          <w:between w:val="nil"/>
+        </w:pBdr>
+        <w:rPr>
+          <w:color w:val="000000"/>
+          <w:sz w:val="24"/>
+          <w:szCs w:val="24"/>
+          <w:lang w:val="en-IN"/>
+        </w:rPr>
+      </w:pPr>
+      <w:r>
+        <w:rPr>
+          <w:color w:val="000000"/>
+          <w:sz w:val="24"/>
+          <w:szCs w:val="24"/>
+          <w:lang w:val="en-IN"/>
+        </w:rPr>
+        <w:t xml:space="preserve">    language </w:t>
+      </w:r>
+      <w:proofErr w:type="gramStart"/>
+      <w:r>
+        <w:rPr>
+          <w:color w:val="000000"/>
+          <w:sz w:val="24"/>
+          <w:szCs w:val="24"/>
+          <w:lang w:val="en-IN"/>
+        </w:rPr>
+        <w:t>VARCHAR(</w:t>
+      </w:r>
+      <w:proofErr w:type="gramEnd"/>
+      <w:r>
+        <w:rPr>
+          <w:color w:val="000000"/>
+          <w:sz w:val="24"/>
+          <w:szCs w:val="24"/>
+          <w:lang w:val="en-IN"/>
+        </w:rPr>
+        <w:t>20),</w:t>
       </w:r>
     </w:p>
     <w:p>
@@ -764,7 +844,27 @@
           <w:szCs w:val="24"/>
           <w:lang w:val="en-IN"/>
         </w:rPr>
-        <w:t xml:space="preserve">    rating DECIMAL(3,1)</w:t>
+        <w:t xml:space="preserve">    rating </w:t>
+      </w:r>
+      <w:proofErr w:type="gramStart"/>
+      <w:r>
+        <w:rPr>
+          <w:color w:val="000000"/>
+          <w:sz w:val="24"/>
+          <w:szCs w:val="24"/>
+          <w:lang w:val="en-IN"/>
+        </w:rPr>
+        <w:t>DECIMAL(</w:t>
+      </w:r>
+      <w:proofErr w:type="gramEnd"/>
+      <w:r>
+        <w:rPr>
+          <w:color w:val="000000"/>
+          <w:sz w:val="24"/>
+          <w:szCs w:val="24"/>
+          <w:lang w:val="en-IN"/>
+        </w:rPr>
+        <w:t>3,1)</w:t>
       </w:r>
     </w:p>
     <w:p>
@@ -838,6 +938,7 @@
       </w:pPr>
       <w:r>
         <w:rPr>
+          <w:noProof/>
           <w:color w:val="000000"/>
           <w:sz w:val="24"/>
           <w:szCs w:val="24"/>
@@ -972,36 +1073,102 @@
           <w:sz w:val="20"/>
           <w:szCs w:val="20"/>
         </w:rPr>
-        <w:t xml:space="preserve">    theatre_id NUMBER(5) PRIMARY KEY,</w:t>
-      </w:r>
-    </w:p>
-    <w:p>
-      <w:pPr>
-        <w:widowControl/>
-        <w:pBdr>
-          <w:top w:val="nil"/>
-          <w:left w:val="nil"/>
-          <w:bottom w:val="nil"/>
-          <w:right w:val="nil"/>
-          <w:between w:val="nil"/>
-        </w:pBdr>
-        <w:rPr>
-          <w:b/>
-          <w:bCs/>
-          <w:color w:val="000000"/>
-          <w:sz w:val="20"/>
-          <w:szCs w:val="20"/>
-        </w:rPr>
-      </w:pPr>
-      <w:r>
-        <w:rPr>
-          <w:b/>
-          <w:bCs/>
-          <w:color w:val="000000"/>
-          <w:sz w:val="20"/>
-          <w:szCs w:val="20"/>
-        </w:rPr>
-        <w:t xml:space="preserve">    theatre_name VARCHAR2(50) NOT NULL,</w:t>
+        <w:t xml:space="preserve">    </w:t>
+      </w:r>
+      <w:proofErr w:type="spellStart"/>
+      <w:r>
+        <w:rPr>
+          <w:b/>
+          <w:bCs/>
+          <w:color w:val="000000"/>
+          <w:sz w:val="20"/>
+          <w:szCs w:val="20"/>
+        </w:rPr>
+        <w:t>theatre_id</w:t>
+      </w:r>
+      <w:proofErr w:type="spellEnd"/>
+      <w:r>
+        <w:rPr>
+          <w:b/>
+          <w:bCs/>
+          <w:color w:val="000000"/>
+          <w:sz w:val="20"/>
+          <w:szCs w:val="20"/>
+        </w:rPr>
+        <w:t xml:space="preserve"> </w:t>
+      </w:r>
+      <w:proofErr w:type="gramStart"/>
+      <w:r>
+        <w:rPr>
+          <w:b/>
+          <w:bCs/>
+          <w:color w:val="000000"/>
+          <w:sz w:val="20"/>
+          <w:szCs w:val="20"/>
+        </w:rPr>
+        <w:t>NUMBER(</w:t>
+      </w:r>
+      <w:proofErr w:type="gramEnd"/>
+      <w:r>
+        <w:rPr>
+          <w:b/>
+          <w:bCs/>
+          <w:color w:val="000000"/>
+          <w:sz w:val="20"/>
+          <w:szCs w:val="20"/>
+        </w:rPr>
+        <w:t>5) PRIMARY KEY,</w:t>
+      </w:r>
+    </w:p>
+    <w:p>
+      <w:pPr>
+        <w:widowControl/>
+        <w:pBdr>
+          <w:top w:val="nil"/>
+          <w:left w:val="nil"/>
+          <w:bottom w:val="nil"/>
+          <w:right w:val="nil"/>
+          <w:between w:val="nil"/>
+        </w:pBdr>
+        <w:rPr>
+          <w:b/>
+          <w:bCs/>
+          <w:color w:val="000000"/>
+          <w:sz w:val="20"/>
+          <w:szCs w:val="20"/>
+        </w:rPr>
+      </w:pPr>
+      <w:r>
+        <w:rPr>
+          <w:b/>
+          <w:bCs/>
+          <w:color w:val="000000"/>
+          <w:sz w:val="20"/>
+          <w:szCs w:val="20"/>
+        </w:rPr>
+        <w:t xml:space="preserve">    </w:t>
+      </w:r>
+      <w:proofErr w:type="spellStart"/>
+      <w:r>
+        <w:rPr>
+          <w:b/>
+          <w:bCs/>
+          <w:color w:val="000000"/>
+          <w:sz w:val="20"/>
+          <w:szCs w:val="20"/>
+        </w:rPr>
+        <w:t>theatre_name</w:t>
+      </w:r>
+      <w:proofErr w:type="spellEnd"/>
+      <w:r>
+        <w:rPr>
+          <w:b/>
+          <w:bCs/>
+          <w:color w:val="000000"/>
+          <w:sz w:val="20"/>
+          <w:szCs w:val="20"/>
+        </w:rPr>
+        <w:t xml:space="preserve"> VARCHAR2(50) NOT NULL,</w:t>
       </w:r>
     </w:p>
     <w:p>
@@ -1109,6 +1276,7 @@
       </w:pPr>
       <w:r>
         <w:rPr>
+          <w:noProof/>
           <w:color w:val="000000"/>
           <w:sz w:val="24"/>
           <w:szCs w:val="24"/>
@@ -1251,36 +1419,102 @@
           <w:szCs w:val="20"/>
           <w:lang w:val="en-IN"/>
         </w:rPr>
-        <w:t xml:space="preserve">    screen_id INT PRIMARY KEY,</w:t>
-      </w:r>
-    </w:p>
-    <w:p>
-      <w:pPr>
-        <w:widowControl/>
-        <w:pBdr>
-          <w:top w:val="nil"/>
-          <w:left w:val="nil"/>
-          <w:bottom w:val="nil"/>
-          <w:right w:val="nil"/>
-          <w:between w:val="nil"/>
-        </w:pBdr>
-        <w:rPr>
-          <w:b/>
-          <w:bCs/>
-          <w:sz w:val="20"/>
-          <w:szCs w:val="20"/>
-          <w:lang w:val="en-IN"/>
-        </w:rPr>
-      </w:pPr>
-      <w:r>
-        <w:rPr>
-          <w:b/>
-          <w:bCs/>
-          <w:sz w:val="20"/>
-          <w:szCs w:val="20"/>
-          <w:lang w:val="en-IN"/>
-        </w:rPr>
-        <w:t xml:space="preserve">    screen_name VARCHAR(20) NOT NULL,</w:t>
+        <w:t xml:space="preserve">    </w:t>
+      </w:r>
+      <w:proofErr w:type="spellStart"/>
+      <w:r>
+        <w:rPr>
+          <w:b/>
+          <w:bCs/>
+          <w:sz w:val="20"/>
+          <w:szCs w:val="20"/>
+          <w:lang w:val="en-IN"/>
+        </w:rPr>
+        <w:t>screen_id</w:t>
+      </w:r>
+      <w:proofErr w:type="spellEnd"/>
+      <w:r>
+        <w:rPr>
+          <w:b/>
+          <w:bCs/>
+          <w:sz w:val="20"/>
+          <w:szCs w:val="20"/>
+          <w:lang w:val="en-IN"/>
+        </w:rPr>
+        <w:t xml:space="preserve"> INT PRIMARY KEY,</w:t>
+      </w:r>
+    </w:p>
+    <w:p>
+      <w:pPr>
+        <w:widowControl/>
+        <w:pBdr>
+          <w:top w:val="nil"/>
+          <w:left w:val="nil"/>
+          <w:bottom w:val="nil"/>
+          <w:right w:val="nil"/>
+          <w:between w:val="nil"/>
+        </w:pBdr>
+        <w:rPr>
+          <w:b/>
+          <w:bCs/>
+          <w:sz w:val="20"/>
+          <w:szCs w:val="20"/>
+          <w:lang w:val="en-IN"/>
+        </w:rPr>
+      </w:pPr>
+      <w:r>
+        <w:rPr>
+          <w:b/>
+          <w:bCs/>
+          <w:sz w:val="20"/>
+          <w:szCs w:val="20"/>
+          <w:lang w:val="en-IN"/>
+        </w:rPr>
+        <w:t xml:space="preserve">    </w:t>
+      </w:r>
+      <w:proofErr w:type="spellStart"/>
+      <w:r>
+        <w:rPr>
+          <w:b/>
+          <w:bCs/>
+          <w:sz w:val="20"/>
+          <w:szCs w:val="20"/>
+          <w:lang w:val="en-IN"/>
+        </w:rPr>
+        <w:t>screen_name</w:t>
+      </w:r>
+      <w:proofErr w:type="spellEnd"/>
+      <w:r>
+        <w:rPr>
+          <w:b/>
+          <w:bCs/>
+          <w:sz w:val="20"/>
+          <w:szCs w:val="20"/>
+          <w:lang w:val="en-IN"/>
+        </w:rPr>
+        <w:t xml:space="preserve"> </w:t>
+      </w:r>
+      <w:proofErr w:type="gramStart"/>
+      <w:r>
+        <w:rPr>
+          <w:b/>
+          <w:bCs/>
+          <w:sz w:val="20"/>
+          <w:szCs w:val="20"/>
+          <w:lang w:val="en-IN"/>
+        </w:rPr>
+        <w:t>VARCHAR(</w:t>
+      </w:r>
+      <w:proofErr w:type="gramEnd"/>
+      <w:r>
+        <w:rPr>
+          <w:b/>
+          <w:bCs/>
+          <w:sz w:val="20"/>
+          <w:szCs w:val="20"/>
+          <w:lang w:val="en-IN"/>
+        </w:rPr>
+        <w:t>20) NOT NULL,</w:t>
       </w:r>
     </w:p>
     <w:p>
@@ -1338,65 +1572,143 @@
           <w:szCs w:val="20"/>
           <w:lang w:val="en-IN"/>
         </w:rPr>
-        <w:t xml:space="preserve">    theatre_id INT,</w:t>
-      </w:r>
-    </w:p>
-    <w:p>
-      <w:pPr>
-        <w:widowControl/>
-        <w:pBdr>
-          <w:top w:val="nil"/>
-          <w:left w:val="nil"/>
-          <w:bottom w:val="nil"/>
-          <w:right w:val="nil"/>
-          <w:between w:val="nil"/>
-        </w:pBdr>
-        <w:rPr>
-          <w:b/>
-          <w:bCs/>
-          <w:sz w:val="20"/>
-          <w:szCs w:val="20"/>
-          <w:lang w:val="en-IN"/>
-        </w:rPr>
-      </w:pPr>
-      <w:r>
-        <w:rPr>
-          <w:b/>
-          <w:bCs/>
-          <w:sz w:val="20"/>
-          <w:szCs w:val="20"/>
-          <w:lang w:val="en-IN"/>
-        </w:rPr>
-        <w:t xml:space="preserve">    FOREIGN KEY (theatre_id)</w:t>
-      </w:r>
-    </w:p>
-    <w:p>
-      <w:pPr>
-        <w:widowControl/>
-        <w:pBdr>
-          <w:top w:val="nil"/>
-          <w:left w:val="nil"/>
-          <w:bottom w:val="nil"/>
-          <w:right w:val="nil"/>
-          <w:between w:val="nil"/>
-        </w:pBdr>
-        <w:rPr>
-          <w:b/>
-          <w:bCs/>
-          <w:sz w:val="20"/>
-          <w:szCs w:val="20"/>
-          <w:lang w:val="en-IN"/>
-        </w:rPr>
-      </w:pPr>
-      <w:r>
-        <w:rPr>
-          <w:b/>
-          <w:bCs/>
-          <w:sz w:val="20"/>
-          <w:szCs w:val="20"/>
-          <w:lang w:val="en-IN"/>
-        </w:rPr>
-        <w:t xml:space="preserve">        REFERENCES THEATRE(theatre_id)</w:t>
+        <w:t xml:space="preserve">    </w:t>
+      </w:r>
+      <w:proofErr w:type="spellStart"/>
+      <w:r>
+        <w:rPr>
+          <w:b/>
+          <w:bCs/>
+          <w:sz w:val="20"/>
+          <w:szCs w:val="20"/>
+          <w:lang w:val="en-IN"/>
+        </w:rPr>
+        <w:t>theatre_id</w:t>
+      </w:r>
+      <w:proofErr w:type="spellEnd"/>
+      <w:r>
+        <w:rPr>
+          <w:b/>
+          <w:bCs/>
+          <w:sz w:val="20"/>
+          <w:szCs w:val="20"/>
+          <w:lang w:val="en-IN"/>
+        </w:rPr>
+        <w:t xml:space="preserve"> INT,</w:t>
+      </w:r>
+    </w:p>
+    <w:p>
+      <w:pPr>
+        <w:widowControl/>
+        <w:pBdr>
+          <w:top w:val="nil"/>
+          <w:left w:val="nil"/>
+          <w:bottom w:val="nil"/>
+          <w:right w:val="nil"/>
+          <w:between w:val="nil"/>
+        </w:pBdr>
+        <w:rPr>
+          <w:b/>
+          <w:bCs/>
+          <w:sz w:val="20"/>
+          <w:szCs w:val="20"/>
+          <w:lang w:val="en-IN"/>
+        </w:rPr>
+      </w:pPr>
+      <w:r>
+        <w:rPr>
+          <w:b/>
+          <w:bCs/>
+          <w:sz w:val="20"/>
+          <w:szCs w:val="20"/>
+          <w:lang w:val="en-IN"/>
+        </w:rPr>
+        <w:t xml:space="preserve">    FOREIGN KEY (</w:t>
+      </w:r>
+      <w:proofErr w:type="spellStart"/>
+      <w:r>
+        <w:rPr>
+          <w:b/>
+          <w:bCs/>
+          <w:sz w:val="20"/>
+          <w:szCs w:val="20"/>
+          <w:lang w:val="en-IN"/>
+        </w:rPr>
+        <w:t>theatre_id</w:t>
+      </w:r>
+      <w:proofErr w:type="spellEnd"/>
+      <w:r>
+        <w:rPr>
+          <w:b/>
+          <w:bCs/>
+          <w:sz w:val="20"/>
+          <w:szCs w:val="20"/>
+          <w:lang w:val="en-IN"/>
+        </w:rPr>
+        <w:t>)</w:t>
+      </w:r>
+    </w:p>
+    <w:p>
+      <w:pPr>
+        <w:widowControl/>
+        <w:pBdr>
+          <w:top w:val="nil"/>
+          <w:left w:val="nil"/>
+          <w:bottom w:val="nil"/>
+          <w:right w:val="nil"/>
+          <w:between w:val="nil"/>
+        </w:pBdr>
+        <w:rPr>
+          <w:b/>
+          <w:bCs/>
+          <w:sz w:val="20"/>
+          <w:szCs w:val="20"/>
+          <w:lang w:val="en-IN"/>
+        </w:rPr>
+      </w:pPr>
+      <w:r>
+        <w:rPr>
+          <w:b/>
+          <w:bCs/>
+          <w:sz w:val="20"/>
+          <w:szCs w:val="20"/>
+          <w:lang w:val="en-IN"/>
+        </w:rPr>
+        <w:t xml:space="preserve">        REFERENCES </w:t>
+      </w:r>
+      <w:proofErr w:type="gramStart"/>
+      <w:r>
+        <w:rPr>
+          <w:b/>
+          <w:bCs/>
+          <w:sz w:val="20"/>
+          <w:szCs w:val="20"/>
+          <w:lang w:val="en-IN"/>
+        </w:rPr>
+        <w:t>THEATRE(</w:t>
+      </w:r>
+      <w:proofErr w:type="spellStart"/>
+      <w:proofErr w:type="gramEnd"/>
+      <w:r>
+        <w:rPr>
+          <w:b/>
+          <w:bCs/>
+          <w:sz w:val="20"/>
+          <w:szCs w:val="20"/>
+          <w:lang w:val="en-IN"/>
+        </w:rPr>
+        <w:t>theatre_id</w:t>
+      </w:r>
+      <w:proofErr w:type="spellEnd"/>
+      <w:r>
+        <w:rPr>
+          <w:b/>
+          <w:bCs/>
+          <w:sz w:val="20"/>
+          <w:szCs w:val="20"/>
+          <w:lang w:val="en-IN"/>
+        </w:rPr>
+        <w:t>)</w:t>
       </w:r>
     </w:p>
     <w:p>
@@ -1446,6 +1758,7 @@
       </w:pPr>
       <w:r>
         <w:rPr>
+          <w:noProof/>
           <w:color w:val="000000"/>
           <w:sz w:val="24"/>
           <w:szCs w:val="24"/>
@@ -1559,297 +1872,585 @@
           <w:sz w:val="20"/>
           <w:szCs w:val="20"/>
         </w:rPr>
-        <w:t xml:space="preserve">    show_id INT PRIMARY KEY,</w:t>
-      </w:r>
-    </w:p>
-    <w:p>
-      <w:pPr>
-        <w:widowControl/>
-        <w:pBdr>
-          <w:top w:val="nil"/>
-          <w:left w:val="nil"/>
-          <w:bottom w:val="nil"/>
-          <w:right w:val="nil"/>
-          <w:between w:val="nil"/>
-        </w:pBdr>
-        <w:rPr>
-          <w:b/>
-          <w:bCs/>
-          <w:color w:val="000000"/>
-          <w:sz w:val="20"/>
-          <w:szCs w:val="20"/>
-        </w:rPr>
-      </w:pPr>
-      <w:r>
-        <w:rPr>
-          <w:b/>
-          <w:bCs/>
-          <w:color w:val="000000"/>
-          <w:sz w:val="20"/>
-          <w:szCs w:val="20"/>
-        </w:rPr>
-        <w:t xml:space="preserve">    movie_id INT,</w:t>
-      </w:r>
-    </w:p>
-    <w:p>
-      <w:pPr>
-        <w:widowControl/>
-        <w:pBdr>
-          <w:top w:val="nil"/>
-          <w:left w:val="nil"/>
-          <w:bottom w:val="nil"/>
-          <w:right w:val="nil"/>
-          <w:between w:val="nil"/>
-        </w:pBdr>
-        <w:rPr>
-          <w:b/>
-          <w:bCs/>
-          <w:color w:val="000000"/>
-          <w:sz w:val="20"/>
-          <w:szCs w:val="20"/>
-        </w:rPr>
-      </w:pPr>
-      <w:r>
-        <w:rPr>
-          <w:b/>
-          <w:bCs/>
-          <w:color w:val="000000"/>
-          <w:sz w:val="20"/>
-          <w:szCs w:val="20"/>
-        </w:rPr>
-        <w:t xml:space="preserve">    screen_id INT,</w:t>
-      </w:r>
-    </w:p>
-    <w:p>
-      <w:pPr>
-        <w:widowControl/>
-        <w:pBdr>
-          <w:top w:val="nil"/>
-          <w:left w:val="nil"/>
-          <w:bottom w:val="nil"/>
-          <w:right w:val="nil"/>
-          <w:between w:val="nil"/>
-        </w:pBdr>
-        <w:rPr>
-          <w:b/>
-          <w:bCs/>
-          <w:color w:val="000000"/>
-          <w:sz w:val="20"/>
-          <w:szCs w:val="20"/>
-        </w:rPr>
-      </w:pPr>
-      <w:r>
-        <w:rPr>
-          <w:b/>
-          <w:bCs/>
-          <w:color w:val="000000"/>
-          <w:sz w:val="20"/>
-          <w:szCs w:val="20"/>
-        </w:rPr>
-        <w:t xml:space="preserve">    show_date DATE,</w:t>
-      </w:r>
-    </w:p>
-    <w:p>
-      <w:pPr>
-        <w:widowControl/>
-        <w:pBdr>
-          <w:top w:val="nil"/>
-          <w:left w:val="nil"/>
-          <w:bottom w:val="nil"/>
-          <w:right w:val="nil"/>
-          <w:between w:val="nil"/>
-        </w:pBdr>
-        <w:rPr>
-          <w:b/>
-          <w:bCs/>
-          <w:color w:val="000000"/>
-          <w:sz w:val="20"/>
-          <w:szCs w:val="20"/>
-        </w:rPr>
-      </w:pPr>
-      <w:r>
-        <w:rPr>
-          <w:b/>
-          <w:bCs/>
-          <w:color w:val="000000"/>
-          <w:sz w:val="20"/>
-          <w:szCs w:val="20"/>
-        </w:rPr>
-        <w:t xml:space="preserve">    show_time TIME,</w:t>
-      </w:r>
-    </w:p>
-    <w:p>
-      <w:pPr>
-        <w:widowControl/>
-        <w:pBdr>
-          <w:top w:val="nil"/>
-          <w:left w:val="nil"/>
-          <w:bottom w:val="nil"/>
-          <w:right w:val="nil"/>
-          <w:between w:val="nil"/>
-        </w:pBdr>
-        <w:rPr>
-          <w:b/>
-          <w:bCs/>
-          <w:color w:val="000000"/>
-          <w:sz w:val="20"/>
-          <w:szCs w:val="20"/>
-        </w:rPr>
-      </w:pPr>
-      <w:r>
-        <w:rPr>
-          <w:b/>
-          <w:bCs/>
-          <w:color w:val="000000"/>
-          <w:sz w:val="20"/>
-          <w:szCs w:val="20"/>
-        </w:rPr>
-        <w:t xml:space="preserve">    ticket_price DECIMAL(8,2)</w:t>
-      </w:r>
-    </w:p>
-    <w:p>
-      <w:pPr>
-        <w:widowControl/>
-        <w:pBdr>
-          <w:top w:val="nil"/>
-          <w:left w:val="nil"/>
-          <w:bottom w:val="nil"/>
-          <w:right w:val="nil"/>
-          <w:between w:val="nil"/>
-        </w:pBdr>
-        <w:rPr>
-          <w:b/>
-          <w:bCs/>
-          <w:color w:val="000000"/>
-          <w:sz w:val="20"/>
-          <w:szCs w:val="20"/>
-        </w:rPr>
-      </w:pPr>
-      <w:r>
-        <w:rPr>
-          <w:b/>
-          <w:bCs/>
-          <w:color w:val="000000"/>
-          <w:sz w:val="20"/>
-          <w:szCs w:val="20"/>
-        </w:rPr>
-        <w:t xml:space="preserve">        CHECK (ticket_price &gt; 0),</w:t>
-      </w:r>
-    </w:p>
-    <w:p>
-      <w:pPr>
-        <w:widowControl/>
-        <w:pBdr>
-          <w:top w:val="nil"/>
-          <w:left w:val="nil"/>
-          <w:bottom w:val="nil"/>
-          <w:right w:val="nil"/>
-          <w:between w:val="nil"/>
-        </w:pBdr>
-        <w:rPr>
-          <w:b/>
-          <w:bCs/>
-          <w:color w:val="000000"/>
-          <w:sz w:val="20"/>
-          <w:szCs w:val="20"/>
-        </w:rPr>
-      </w:pPr>
-      <w:r>
-        <w:rPr>
-          <w:b/>
-          <w:bCs/>
-          <w:color w:val="000000"/>
-          <w:sz w:val="20"/>
-          <w:szCs w:val="20"/>
-        </w:rPr>
-        <w:t xml:space="preserve">    FOREIGN KEY (movie_id)</w:t>
-      </w:r>
-    </w:p>
-    <w:p>
-      <w:pPr>
-        <w:widowControl/>
-        <w:pBdr>
-          <w:top w:val="nil"/>
-          <w:left w:val="nil"/>
-          <w:bottom w:val="nil"/>
-          <w:right w:val="nil"/>
-          <w:between w:val="nil"/>
-        </w:pBdr>
-        <w:rPr>
-          <w:b/>
-          <w:bCs/>
-          <w:color w:val="000000"/>
-          <w:sz w:val="20"/>
-          <w:szCs w:val="20"/>
-        </w:rPr>
-      </w:pPr>
-      <w:r>
-        <w:rPr>
-          <w:b/>
-          <w:bCs/>
-          <w:color w:val="000000"/>
-          <w:sz w:val="20"/>
-          <w:szCs w:val="20"/>
-        </w:rPr>
-        <w:t xml:space="preserve">        REFERENCES MOVIE(movie_id),</w:t>
-      </w:r>
-    </w:p>
-    <w:p>
-      <w:pPr>
-        <w:widowControl/>
-        <w:pBdr>
-          <w:top w:val="nil"/>
-          <w:left w:val="nil"/>
-          <w:bottom w:val="nil"/>
-          <w:right w:val="nil"/>
-          <w:between w:val="nil"/>
-        </w:pBdr>
-        <w:rPr>
-          <w:b/>
-          <w:bCs/>
-          <w:color w:val="000000"/>
-          <w:sz w:val="20"/>
-          <w:szCs w:val="20"/>
-        </w:rPr>
-      </w:pPr>
-      <w:r>
-        <w:rPr>
-          <w:b/>
-          <w:bCs/>
-          <w:color w:val="000000"/>
-          <w:sz w:val="20"/>
-          <w:szCs w:val="20"/>
-        </w:rPr>
-        <w:t xml:space="preserve">    FOREIGN KEY (screen_id)</w:t>
-      </w:r>
-    </w:p>
-    <w:p>
-      <w:pPr>
-        <w:widowControl/>
-        <w:pBdr>
-          <w:top w:val="nil"/>
-          <w:left w:val="nil"/>
-          <w:bottom w:val="nil"/>
-          <w:right w:val="nil"/>
-          <w:between w:val="nil"/>
-        </w:pBdr>
-        <w:rPr>
-          <w:b/>
-          <w:bCs/>
-          <w:color w:val="000000"/>
-          <w:sz w:val="20"/>
-          <w:szCs w:val="20"/>
-        </w:rPr>
-      </w:pPr>
-      <w:r>
-        <w:rPr>
-          <w:b/>
-          <w:bCs/>
-          <w:color w:val="000000"/>
-          <w:sz w:val="20"/>
-          <w:szCs w:val="20"/>
-        </w:rPr>
-        <w:t xml:space="preserve">        REFERENCES SCREEN(screen_id)</w:t>
+        <w:t xml:space="preserve">    </w:t>
+      </w:r>
+      <w:proofErr w:type="spellStart"/>
+      <w:r>
+        <w:rPr>
+          <w:b/>
+          <w:bCs/>
+          <w:color w:val="000000"/>
+          <w:sz w:val="20"/>
+          <w:szCs w:val="20"/>
+        </w:rPr>
+        <w:t>show_id</w:t>
+      </w:r>
+      <w:proofErr w:type="spellEnd"/>
+      <w:r>
+        <w:rPr>
+          <w:b/>
+          <w:bCs/>
+          <w:color w:val="000000"/>
+          <w:sz w:val="20"/>
+          <w:szCs w:val="20"/>
+        </w:rPr>
+        <w:t xml:space="preserve"> INT PRIMARY KEY,</w:t>
+      </w:r>
+    </w:p>
+    <w:p>
+      <w:pPr>
+        <w:widowControl/>
+        <w:pBdr>
+          <w:top w:val="nil"/>
+          <w:left w:val="nil"/>
+          <w:bottom w:val="nil"/>
+          <w:right w:val="nil"/>
+          <w:between w:val="nil"/>
+        </w:pBdr>
+        <w:rPr>
+          <w:b/>
+          <w:bCs/>
+          <w:color w:val="000000"/>
+          <w:sz w:val="20"/>
+          <w:szCs w:val="20"/>
+        </w:rPr>
+      </w:pPr>
+      <w:r>
+        <w:rPr>
+          <w:b/>
+          <w:bCs/>
+          <w:color w:val="000000"/>
+          <w:sz w:val="20"/>
+          <w:szCs w:val="20"/>
+        </w:rPr>
+        <w:t xml:space="preserve">    </w:t>
+      </w:r>
+      <w:proofErr w:type="spellStart"/>
+      <w:r>
+        <w:rPr>
+          <w:b/>
+          <w:bCs/>
+          <w:color w:val="000000"/>
+          <w:sz w:val="20"/>
+          <w:szCs w:val="20"/>
+        </w:rPr>
+        <w:t>movie_id</w:t>
+      </w:r>
+      <w:proofErr w:type="spellEnd"/>
+      <w:r>
+        <w:rPr>
+          <w:b/>
+          <w:bCs/>
+          <w:color w:val="000000"/>
+          <w:sz w:val="20"/>
+          <w:szCs w:val="20"/>
+        </w:rPr>
+        <w:t xml:space="preserve"> INT,</w:t>
+      </w:r>
+    </w:p>
+    <w:p>
+      <w:pPr>
+        <w:widowControl/>
+        <w:pBdr>
+          <w:top w:val="nil"/>
+          <w:left w:val="nil"/>
+          <w:bottom w:val="nil"/>
+          <w:right w:val="nil"/>
+          <w:between w:val="nil"/>
+        </w:pBdr>
+        <w:rPr>
+          <w:b/>
+          <w:bCs/>
+          <w:color w:val="000000"/>
+          <w:sz w:val="20"/>
+          <w:szCs w:val="20"/>
+        </w:rPr>
+      </w:pPr>
+      <w:r>
+        <w:rPr>
+          <w:b/>
+          <w:bCs/>
+          <w:color w:val="000000"/>
+          <w:sz w:val="20"/>
+          <w:szCs w:val="20"/>
+        </w:rPr>
+        <w:t xml:space="preserve">    </w:t>
+      </w:r>
+      <w:proofErr w:type="spellStart"/>
+      <w:r>
+        <w:rPr>
+          <w:b/>
+          <w:bCs/>
+          <w:color w:val="000000"/>
+          <w:sz w:val="20"/>
+          <w:szCs w:val="20"/>
+        </w:rPr>
+        <w:t>screen_id</w:t>
+      </w:r>
+      <w:proofErr w:type="spellEnd"/>
+      <w:r>
+        <w:rPr>
+          <w:b/>
+          <w:bCs/>
+          <w:color w:val="000000"/>
+          <w:sz w:val="20"/>
+          <w:szCs w:val="20"/>
+        </w:rPr>
+        <w:t xml:space="preserve"> INT,</w:t>
+      </w:r>
+    </w:p>
+    <w:p>
+      <w:pPr>
+        <w:widowControl/>
+        <w:pBdr>
+          <w:top w:val="nil"/>
+          <w:left w:val="nil"/>
+          <w:bottom w:val="nil"/>
+          <w:right w:val="nil"/>
+          <w:between w:val="nil"/>
+        </w:pBdr>
+        <w:rPr>
+          <w:b/>
+          <w:bCs/>
+          <w:color w:val="000000"/>
+          <w:sz w:val="20"/>
+          <w:szCs w:val="20"/>
+        </w:rPr>
+      </w:pPr>
+      <w:r>
+        <w:rPr>
+          <w:b/>
+          <w:bCs/>
+          <w:color w:val="000000"/>
+          <w:sz w:val="20"/>
+          <w:szCs w:val="20"/>
+        </w:rPr>
+        <w:t xml:space="preserve">    </w:t>
+      </w:r>
+      <w:proofErr w:type="spellStart"/>
+      <w:r>
+        <w:rPr>
+          <w:b/>
+          <w:bCs/>
+          <w:color w:val="000000"/>
+          <w:sz w:val="20"/>
+          <w:szCs w:val="20"/>
+        </w:rPr>
+        <w:t>show_date</w:t>
+      </w:r>
+      <w:proofErr w:type="spellEnd"/>
+      <w:r>
+        <w:rPr>
+          <w:b/>
+          <w:bCs/>
+          <w:color w:val="000000"/>
+          <w:sz w:val="20"/>
+          <w:szCs w:val="20"/>
+        </w:rPr>
+        <w:t xml:space="preserve"> DATE,</w:t>
+      </w:r>
+    </w:p>
+    <w:p>
+      <w:pPr>
+        <w:widowControl/>
+        <w:pBdr>
+          <w:top w:val="nil"/>
+          <w:left w:val="nil"/>
+          <w:bottom w:val="nil"/>
+          <w:right w:val="nil"/>
+          <w:between w:val="nil"/>
+        </w:pBdr>
+        <w:rPr>
+          <w:b/>
+          <w:bCs/>
+          <w:color w:val="000000"/>
+          <w:sz w:val="20"/>
+          <w:szCs w:val="20"/>
+        </w:rPr>
+      </w:pPr>
+      <w:r>
+        <w:rPr>
+          <w:b/>
+          <w:bCs/>
+          <w:color w:val="000000"/>
+          <w:sz w:val="20"/>
+          <w:szCs w:val="20"/>
+        </w:rPr>
+        <w:t xml:space="preserve">    </w:t>
+      </w:r>
+      <w:proofErr w:type="spellStart"/>
+      <w:r>
+        <w:rPr>
+          <w:b/>
+          <w:bCs/>
+          <w:color w:val="000000"/>
+          <w:sz w:val="20"/>
+          <w:szCs w:val="20"/>
+        </w:rPr>
+        <w:t>show_time</w:t>
+      </w:r>
+      <w:proofErr w:type="spellEnd"/>
+      <w:r>
+        <w:rPr>
+          <w:b/>
+          <w:bCs/>
+          <w:color w:val="000000"/>
+          <w:sz w:val="20"/>
+          <w:szCs w:val="20"/>
+        </w:rPr>
+        <w:t xml:space="preserve"> TIME,</w:t>
+      </w:r>
+    </w:p>
+    <w:p>
+      <w:pPr>
+        <w:widowControl/>
+        <w:pBdr>
+          <w:top w:val="nil"/>
+          <w:left w:val="nil"/>
+          <w:bottom w:val="nil"/>
+          <w:right w:val="nil"/>
+          <w:between w:val="nil"/>
+        </w:pBdr>
+        <w:rPr>
+          <w:b/>
+          <w:bCs/>
+          <w:color w:val="000000"/>
+          <w:sz w:val="20"/>
+          <w:szCs w:val="20"/>
+        </w:rPr>
+      </w:pPr>
+      <w:r>
+        <w:rPr>
+          <w:b/>
+          <w:bCs/>
+          <w:color w:val="000000"/>
+          <w:sz w:val="20"/>
+          <w:szCs w:val="20"/>
+        </w:rPr>
+        <w:t xml:space="preserve">    </w:t>
+      </w:r>
+      <w:proofErr w:type="spellStart"/>
+      <w:r>
+        <w:rPr>
+          <w:b/>
+          <w:bCs/>
+          <w:color w:val="000000"/>
+          <w:sz w:val="20"/>
+          <w:szCs w:val="20"/>
+        </w:rPr>
+        <w:t>ticket_price</w:t>
+      </w:r>
+      <w:proofErr w:type="spellEnd"/>
+      <w:r>
+        <w:rPr>
+          <w:b/>
+          <w:bCs/>
+          <w:color w:val="000000"/>
+          <w:sz w:val="20"/>
+          <w:szCs w:val="20"/>
+        </w:rPr>
+        <w:t xml:space="preserve"> </w:t>
+      </w:r>
+      <w:proofErr w:type="gramStart"/>
+      <w:r>
+        <w:rPr>
+          <w:b/>
+          <w:bCs/>
+          <w:color w:val="000000"/>
+          <w:sz w:val="20"/>
+          <w:szCs w:val="20"/>
+        </w:rPr>
+        <w:t>DECIMAL(</w:t>
+      </w:r>
+      <w:proofErr w:type="gramEnd"/>
+      <w:r>
+        <w:rPr>
+          <w:b/>
+          <w:bCs/>
+          <w:color w:val="000000"/>
+          <w:sz w:val="20"/>
+          <w:szCs w:val="20"/>
+        </w:rPr>
+        <w:t>8,2)</w:t>
+      </w:r>
+    </w:p>
+    <w:p>
+      <w:pPr>
+        <w:widowControl/>
+        <w:pBdr>
+          <w:top w:val="nil"/>
+          <w:left w:val="nil"/>
+          <w:bottom w:val="nil"/>
+          <w:right w:val="nil"/>
+          <w:between w:val="nil"/>
+        </w:pBdr>
+        <w:rPr>
+          <w:b/>
+          <w:bCs/>
+          <w:color w:val="000000"/>
+          <w:sz w:val="20"/>
+          <w:szCs w:val="20"/>
+        </w:rPr>
+      </w:pPr>
+      <w:r>
+        <w:rPr>
+          <w:b/>
+          <w:bCs/>
+          <w:color w:val="000000"/>
+          <w:sz w:val="20"/>
+          <w:szCs w:val="20"/>
+        </w:rPr>
+        <w:t xml:space="preserve">        CHECK (</w:t>
+      </w:r>
+      <w:proofErr w:type="spellStart"/>
+      <w:r>
+        <w:rPr>
+          <w:b/>
+          <w:bCs/>
+          <w:color w:val="000000"/>
+          <w:sz w:val="20"/>
+          <w:szCs w:val="20"/>
+        </w:rPr>
+        <w:t>ticket_price</w:t>
+      </w:r>
+      <w:proofErr w:type="spellEnd"/>
+      <w:r>
+        <w:rPr>
+          <w:b/>
+          <w:bCs/>
+          <w:color w:val="000000"/>
+          <w:sz w:val="20"/>
+          <w:szCs w:val="20"/>
+        </w:rPr>
+        <w:t xml:space="preserve"> &gt; 0),</w:t>
+      </w:r>
+    </w:p>
+    <w:p>
+      <w:pPr>
+        <w:widowControl/>
+        <w:pBdr>
+          <w:top w:val="nil"/>
+          <w:left w:val="nil"/>
+          <w:bottom w:val="nil"/>
+          <w:right w:val="nil"/>
+          <w:between w:val="nil"/>
+        </w:pBdr>
+        <w:rPr>
+          <w:b/>
+          <w:bCs/>
+          <w:color w:val="000000"/>
+          <w:sz w:val="20"/>
+          <w:szCs w:val="20"/>
+        </w:rPr>
+      </w:pPr>
+      <w:r>
+        <w:rPr>
+          <w:b/>
+          <w:bCs/>
+          <w:color w:val="000000"/>
+          <w:sz w:val="20"/>
+          <w:szCs w:val="20"/>
+        </w:rPr>
+        <w:t xml:space="preserve">    FOREIGN KEY (</w:t>
+      </w:r>
+      <w:proofErr w:type="spellStart"/>
+      <w:r>
+        <w:rPr>
+          <w:b/>
+          <w:bCs/>
+          <w:color w:val="000000"/>
+          <w:sz w:val="20"/>
+          <w:szCs w:val="20"/>
+        </w:rPr>
+        <w:t>movie_id</w:t>
+      </w:r>
+      <w:proofErr w:type="spellEnd"/>
+      <w:r>
+        <w:rPr>
+          <w:b/>
+          <w:bCs/>
+          <w:color w:val="000000"/>
+          <w:sz w:val="20"/>
+          <w:szCs w:val="20"/>
+        </w:rPr>
+        <w:t>)</w:t>
+      </w:r>
+    </w:p>
+    <w:p>
+      <w:pPr>
+        <w:widowControl/>
+        <w:pBdr>
+          <w:top w:val="nil"/>
+          <w:left w:val="nil"/>
+          <w:bottom w:val="nil"/>
+          <w:right w:val="nil"/>
+          <w:between w:val="nil"/>
+        </w:pBdr>
+        <w:rPr>
+          <w:b/>
+          <w:bCs/>
+          <w:color w:val="000000"/>
+          <w:sz w:val="20"/>
+          <w:szCs w:val="20"/>
+        </w:rPr>
+      </w:pPr>
+      <w:r>
+        <w:rPr>
+          <w:b/>
+          <w:bCs/>
+          <w:color w:val="000000"/>
+          <w:sz w:val="20"/>
+          <w:szCs w:val="20"/>
+        </w:rPr>
+        <w:t xml:space="preserve">        REFERENCES </w:t>
+      </w:r>
+      <w:proofErr w:type="gramStart"/>
+      <w:r>
+        <w:rPr>
+          <w:b/>
+          <w:bCs/>
+          <w:color w:val="000000"/>
+          <w:sz w:val="20"/>
+          <w:szCs w:val="20"/>
+        </w:rPr>
+        <w:t>MOVIE(</w:t>
+      </w:r>
+      <w:proofErr w:type="spellStart"/>
+      <w:proofErr w:type="gramEnd"/>
+      <w:r>
+        <w:rPr>
+          <w:b/>
+          <w:bCs/>
+          <w:color w:val="000000"/>
+          <w:sz w:val="20"/>
+          <w:szCs w:val="20"/>
+        </w:rPr>
+        <w:t>movie_id</w:t>
+      </w:r>
+      <w:proofErr w:type="spellEnd"/>
+      <w:r>
+        <w:rPr>
+          <w:b/>
+          <w:bCs/>
+          <w:color w:val="000000"/>
+          <w:sz w:val="20"/>
+          <w:szCs w:val="20"/>
+        </w:rPr>
+        <w:t>),</w:t>
+      </w:r>
+    </w:p>
+    <w:p>
+      <w:pPr>
+        <w:widowControl/>
+        <w:pBdr>
+          <w:top w:val="nil"/>
+          <w:left w:val="nil"/>
+          <w:bottom w:val="nil"/>
+          <w:right w:val="nil"/>
+          <w:between w:val="nil"/>
+        </w:pBdr>
+        <w:rPr>
+          <w:b/>
+          <w:bCs/>
+          <w:color w:val="000000"/>
+          <w:sz w:val="20"/>
+          <w:szCs w:val="20"/>
+        </w:rPr>
+      </w:pPr>
+      <w:r>
+        <w:rPr>
+          <w:b/>
+          <w:bCs/>
+          <w:color w:val="000000"/>
+          <w:sz w:val="20"/>
+          <w:szCs w:val="20"/>
+        </w:rPr>
+        <w:t xml:space="preserve">    FOREIGN KEY (</w:t>
+      </w:r>
+      <w:proofErr w:type="spellStart"/>
+      <w:r>
+        <w:rPr>
+          <w:b/>
+          <w:bCs/>
+          <w:color w:val="000000"/>
+          <w:sz w:val="20"/>
+          <w:szCs w:val="20"/>
+        </w:rPr>
+        <w:t>screen_id</w:t>
+      </w:r>
+      <w:proofErr w:type="spellEnd"/>
+      <w:r>
+        <w:rPr>
+          <w:b/>
+          <w:bCs/>
+          <w:color w:val="000000"/>
+          <w:sz w:val="20"/>
+          <w:szCs w:val="20"/>
+        </w:rPr>
+        <w:t>)</w:t>
+      </w:r>
+    </w:p>
+    <w:p>
+      <w:pPr>
+        <w:widowControl/>
+        <w:pBdr>
+          <w:top w:val="nil"/>
+          <w:left w:val="nil"/>
+          <w:bottom w:val="nil"/>
+          <w:right w:val="nil"/>
+          <w:between w:val="nil"/>
+        </w:pBdr>
+        <w:rPr>
+          <w:b/>
+          <w:bCs/>
+          <w:color w:val="000000"/>
+          <w:sz w:val="20"/>
+          <w:szCs w:val="20"/>
+        </w:rPr>
+      </w:pPr>
+      <w:r>
+        <w:rPr>
+          <w:b/>
+          <w:bCs/>
+          <w:color w:val="000000"/>
+          <w:sz w:val="20"/>
+          <w:szCs w:val="20"/>
+        </w:rPr>
+        <w:t xml:space="preserve">        REFERENCES </w:t>
+      </w:r>
+      <w:proofErr w:type="gramStart"/>
+      <w:r>
+        <w:rPr>
+          <w:b/>
+          <w:bCs/>
+          <w:color w:val="000000"/>
+          <w:sz w:val="20"/>
+          <w:szCs w:val="20"/>
+        </w:rPr>
+        <w:t>SCREEN(</w:t>
+      </w:r>
+      <w:proofErr w:type="spellStart"/>
+      <w:proofErr w:type="gramEnd"/>
+      <w:r>
+        <w:rPr>
+          <w:b/>
+          <w:bCs/>
+          <w:color w:val="000000"/>
+          <w:sz w:val="20"/>
+          <w:szCs w:val="20"/>
+        </w:rPr>
+        <w:t>screen_id</w:t>
+      </w:r>
+      <w:proofErr w:type="spellEnd"/>
+      <w:r>
+        <w:rPr>
+          <w:b/>
+          <w:bCs/>
+          <w:color w:val="000000"/>
+          <w:sz w:val="20"/>
+          <w:szCs w:val="20"/>
+        </w:rPr>
+        <w:t>)</w:t>
       </w:r>
     </w:p>
     <w:p>
@@ -1914,6 +2515,7 @@
       </w:pPr>
       <w:r>
         <w:rPr>
+          <w:noProof/>
           <w:color w:val="000000"/>
           <w:sz w:val="24"/>
           <w:szCs w:val="24"/>
@@ -2027,181 +2629,413 @@
           <w:sz w:val="20"/>
           <w:szCs w:val="20"/>
         </w:rPr>
-        <w:t xml:space="preserve">    seat_id INT PRIMARY KEY,</w:t>
-      </w:r>
-    </w:p>
-    <w:p>
-      <w:pPr>
-        <w:widowControl/>
-        <w:pBdr>
-          <w:top w:val="nil"/>
-          <w:left w:val="nil"/>
-          <w:bottom w:val="nil"/>
-          <w:right w:val="nil"/>
-          <w:between w:val="nil"/>
-        </w:pBdr>
-        <w:rPr>
-          <w:b/>
-          <w:bCs/>
-          <w:color w:val="000000"/>
-          <w:sz w:val="20"/>
-          <w:szCs w:val="20"/>
-        </w:rPr>
-      </w:pPr>
-      <w:r>
-        <w:rPr>
-          <w:b/>
-          <w:bCs/>
-          <w:color w:val="000000"/>
-          <w:sz w:val="20"/>
-          <w:szCs w:val="20"/>
-        </w:rPr>
-        <w:t xml:space="preserve">    screen_id INT,</w:t>
-      </w:r>
-    </w:p>
-    <w:p>
-      <w:pPr>
-        <w:widowControl/>
-        <w:pBdr>
-          <w:top w:val="nil"/>
-          <w:left w:val="nil"/>
-          <w:bottom w:val="nil"/>
-          <w:right w:val="nil"/>
-          <w:between w:val="nil"/>
-        </w:pBdr>
-        <w:rPr>
-          <w:b/>
-          <w:bCs/>
-          <w:color w:val="000000"/>
-          <w:sz w:val="20"/>
-          <w:szCs w:val="20"/>
-        </w:rPr>
-      </w:pPr>
-      <w:r>
-        <w:rPr>
-          <w:b/>
-          <w:bCs/>
-          <w:color w:val="000000"/>
-          <w:sz w:val="20"/>
-          <w:szCs w:val="20"/>
-        </w:rPr>
-        <w:t xml:space="preserve">    seat_number VARCHAR(10) NOT NULL,</w:t>
-      </w:r>
-    </w:p>
-    <w:p>
-      <w:pPr>
-        <w:widowControl/>
-        <w:pBdr>
-          <w:top w:val="nil"/>
-          <w:left w:val="nil"/>
-          <w:bottom w:val="nil"/>
-          <w:right w:val="nil"/>
-          <w:between w:val="nil"/>
-        </w:pBdr>
-        <w:rPr>
-          <w:b/>
-          <w:bCs/>
-          <w:color w:val="000000"/>
-          <w:sz w:val="20"/>
-          <w:szCs w:val="20"/>
-        </w:rPr>
-      </w:pPr>
-      <w:r>
-        <w:rPr>
-          <w:b/>
-          <w:bCs/>
-          <w:color w:val="000000"/>
-          <w:sz w:val="20"/>
-          <w:szCs w:val="20"/>
-        </w:rPr>
-        <w:t xml:space="preserve">    seat_type VARCHAR(15),</w:t>
-      </w:r>
-    </w:p>
-    <w:p>
-      <w:pPr>
-        <w:widowControl/>
-        <w:pBdr>
-          <w:top w:val="nil"/>
-          <w:left w:val="nil"/>
-          <w:bottom w:val="nil"/>
-          <w:right w:val="nil"/>
-          <w:between w:val="nil"/>
-        </w:pBdr>
-        <w:rPr>
-          <w:b/>
-          <w:bCs/>
-          <w:color w:val="000000"/>
-          <w:sz w:val="20"/>
-          <w:szCs w:val="20"/>
-        </w:rPr>
-      </w:pPr>
-      <w:r>
-        <w:rPr>
-          <w:b/>
-          <w:bCs/>
-          <w:color w:val="000000"/>
-          <w:sz w:val="20"/>
-          <w:szCs w:val="20"/>
-        </w:rPr>
-        <w:t xml:space="preserve">    UNIQUE (screen_id, seat_number),</w:t>
-      </w:r>
-    </w:p>
-    <w:p>
-      <w:pPr>
-        <w:widowControl/>
-        <w:pBdr>
-          <w:top w:val="nil"/>
-          <w:left w:val="nil"/>
-          <w:bottom w:val="nil"/>
-          <w:right w:val="nil"/>
-          <w:between w:val="nil"/>
-        </w:pBdr>
-        <w:rPr>
-          <w:b/>
-          <w:bCs/>
-          <w:color w:val="000000"/>
-          <w:sz w:val="20"/>
-          <w:szCs w:val="20"/>
-        </w:rPr>
-      </w:pPr>
-      <w:r>
-        <w:rPr>
-          <w:b/>
-          <w:bCs/>
-          <w:color w:val="000000"/>
-          <w:sz w:val="20"/>
-          <w:szCs w:val="20"/>
-        </w:rPr>
-        <w:t xml:space="preserve">    FOREIGN KEY (screen_id)</w:t>
-      </w:r>
-    </w:p>
-    <w:p>
-      <w:pPr>
-        <w:widowControl/>
-        <w:pBdr>
-          <w:top w:val="nil"/>
-          <w:left w:val="nil"/>
-          <w:bottom w:val="nil"/>
-          <w:right w:val="nil"/>
-          <w:between w:val="nil"/>
-        </w:pBdr>
-        <w:rPr>
-          <w:b/>
-          <w:bCs/>
-          <w:color w:val="000000"/>
-          <w:sz w:val="20"/>
-          <w:szCs w:val="20"/>
-        </w:rPr>
-      </w:pPr>
-      <w:r>
-        <w:rPr>
-          <w:b/>
-          <w:bCs/>
-          <w:color w:val="000000"/>
-          <w:sz w:val="20"/>
-          <w:szCs w:val="20"/>
-        </w:rPr>
-        <w:t xml:space="preserve">        REFERENCES SCREEN(screen_id)</w:t>
+        <w:t xml:space="preserve">    </w:t>
+      </w:r>
+      <w:proofErr w:type="spellStart"/>
+      <w:r>
+        <w:rPr>
+          <w:b/>
+          <w:bCs/>
+          <w:color w:val="000000"/>
+          <w:sz w:val="20"/>
+          <w:szCs w:val="20"/>
+        </w:rPr>
+        <w:t>seat_id</w:t>
+      </w:r>
+      <w:proofErr w:type="spellEnd"/>
+      <w:r>
+        <w:rPr>
+          <w:b/>
+          <w:bCs/>
+          <w:color w:val="000000"/>
+          <w:sz w:val="20"/>
+          <w:szCs w:val="20"/>
+        </w:rPr>
+        <w:t xml:space="preserve"> INT PRIMARY KEY,</w:t>
+      </w:r>
+    </w:p>
+    <w:p>
+      <w:pPr>
+        <w:widowControl/>
+        <w:pBdr>
+          <w:top w:val="nil"/>
+          <w:left w:val="nil"/>
+          <w:bottom w:val="nil"/>
+          <w:right w:val="nil"/>
+          <w:between w:val="nil"/>
+        </w:pBdr>
+        <w:rPr>
+          <w:b/>
+          <w:bCs/>
+          <w:color w:val="000000"/>
+          <w:sz w:val="20"/>
+          <w:szCs w:val="20"/>
+        </w:rPr>
+      </w:pPr>
+      <w:r>
+        <w:rPr>
+          <w:b/>
+          <w:bCs/>
+          <w:color w:val="000000"/>
+          <w:sz w:val="20"/>
+          <w:szCs w:val="20"/>
+        </w:rPr>
+        <w:t xml:space="preserve">    </w:t>
+      </w:r>
+      <w:proofErr w:type="spellStart"/>
+      <w:r>
+        <w:rPr>
+          <w:b/>
+          <w:bCs/>
+          <w:color w:val="000000"/>
+          <w:sz w:val="20"/>
+          <w:szCs w:val="20"/>
+        </w:rPr>
+        <w:t>screen_id</w:t>
+      </w:r>
+      <w:proofErr w:type="spellEnd"/>
+      <w:r>
+        <w:rPr>
+          <w:b/>
+          <w:bCs/>
+          <w:color w:val="000000"/>
+          <w:sz w:val="20"/>
+          <w:szCs w:val="20"/>
+        </w:rPr>
+        <w:t xml:space="preserve"> INT,</w:t>
+      </w:r>
+    </w:p>
+    <w:p>
+      <w:pPr>
+        <w:widowControl/>
+        <w:pBdr>
+          <w:top w:val="nil"/>
+          <w:left w:val="nil"/>
+          <w:bottom w:val="nil"/>
+          <w:right w:val="nil"/>
+          <w:between w:val="nil"/>
+        </w:pBdr>
+        <w:rPr>
+          <w:b/>
+          <w:bCs/>
+          <w:color w:val="000000"/>
+          <w:sz w:val="20"/>
+          <w:szCs w:val="20"/>
+        </w:rPr>
+      </w:pPr>
+      <w:r>
+        <w:rPr>
+          <w:b/>
+          <w:bCs/>
+          <w:color w:val="000000"/>
+          <w:sz w:val="20"/>
+          <w:szCs w:val="20"/>
+        </w:rPr>
+        <w:t xml:space="preserve">    </w:t>
+      </w:r>
+      <w:proofErr w:type="spellStart"/>
+      <w:r>
+        <w:rPr>
+          <w:b/>
+          <w:bCs/>
+          <w:color w:val="000000"/>
+          <w:sz w:val="20"/>
+          <w:szCs w:val="20"/>
+        </w:rPr>
+        <w:t>seat_number</w:t>
+      </w:r>
+      <w:proofErr w:type="spellEnd"/>
+      <w:r>
+        <w:rPr>
+          <w:b/>
+          <w:bCs/>
+          <w:color w:val="000000"/>
+          <w:sz w:val="20"/>
+          <w:szCs w:val="20"/>
+        </w:rPr>
+        <w:t xml:space="preserve"> </w:t>
+      </w:r>
+      <w:proofErr w:type="gramStart"/>
+      <w:r>
+        <w:rPr>
+          <w:b/>
+          <w:bCs/>
+          <w:color w:val="000000"/>
+          <w:sz w:val="20"/>
+          <w:szCs w:val="20"/>
+        </w:rPr>
+        <w:t>VARCHAR(</w:t>
+      </w:r>
+      <w:proofErr w:type="gramEnd"/>
+      <w:r>
+        <w:rPr>
+          <w:b/>
+          <w:bCs/>
+          <w:color w:val="000000"/>
+          <w:sz w:val="20"/>
+          <w:szCs w:val="20"/>
+        </w:rPr>
+        <w:t>10) NOT NULL,</w:t>
+      </w:r>
+    </w:p>
+    <w:p>
+      <w:pPr>
+        <w:widowControl/>
+        <w:pBdr>
+          <w:top w:val="nil"/>
+          <w:left w:val="nil"/>
+          <w:bottom w:val="nil"/>
+          <w:right w:val="nil"/>
+          <w:between w:val="nil"/>
+        </w:pBdr>
+        <w:rPr>
+          <w:b/>
+          <w:bCs/>
+          <w:color w:val="000000"/>
+          <w:sz w:val="20"/>
+          <w:szCs w:val="20"/>
+        </w:rPr>
+      </w:pPr>
+      <w:r>
+        <w:rPr>
+          <w:b/>
+          <w:bCs/>
+          <w:color w:val="000000"/>
+          <w:sz w:val="20"/>
+          <w:szCs w:val="20"/>
+        </w:rPr>
+        <w:t xml:space="preserve">    </w:t>
+      </w:r>
+      <w:proofErr w:type="spellStart"/>
+      <w:r>
+        <w:rPr>
+          <w:b/>
+          <w:bCs/>
+          <w:color w:val="000000"/>
+          <w:sz w:val="20"/>
+          <w:szCs w:val="20"/>
+        </w:rPr>
+        <w:t>seat_type</w:t>
+      </w:r>
+      <w:proofErr w:type="spellEnd"/>
+      <w:r>
+        <w:rPr>
+          <w:b/>
+          <w:bCs/>
+          <w:color w:val="000000"/>
+          <w:sz w:val="20"/>
+          <w:szCs w:val="20"/>
+        </w:rPr>
+        <w:t xml:space="preserve"> </w:t>
+      </w:r>
+      <w:proofErr w:type="gramStart"/>
+      <w:r>
+        <w:rPr>
+          <w:b/>
+          <w:bCs/>
+          <w:color w:val="000000"/>
+          <w:sz w:val="20"/>
+          <w:szCs w:val="20"/>
+        </w:rPr>
+        <w:t>VARCHAR(</w:t>
+      </w:r>
+      <w:proofErr w:type="gramEnd"/>
+      <w:r>
+        <w:rPr>
+          <w:b/>
+          <w:bCs/>
+          <w:color w:val="000000"/>
+          <w:sz w:val="20"/>
+          <w:szCs w:val="20"/>
+        </w:rPr>
+        <w:t>15),</w:t>
+      </w:r>
+    </w:p>
+    <w:p>
+      <w:pPr>
+        <w:widowControl/>
+        <w:pBdr>
+          <w:top w:val="nil"/>
+          <w:left w:val="nil"/>
+          <w:bottom w:val="nil"/>
+          <w:right w:val="nil"/>
+          <w:between w:val="nil"/>
+        </w:pBdr>
+        <w:rPr>
+          <w:b/>
+          <w:bCs/>
+          <w:color w:val="000000"/>
+          <w:sz w:val="20"/>
+          <w:szCs w:val="20"/>
+        </w:rPr>
+      </w:pPr>
+      <w:r>
+        <w:rPr>
+          <w:b/>
+          <w:bCs/>
+          <w:color w:val="000000"/>
+          <w:sz w:val="20"/>
+          <w:szCs w:val="20"/>
+        </w:rPr>
+        <w:t xml:space="preserve">    UNIQUE (</w:t>
+      </w:r>
+      <w:proofErr w:type="spellStart"/>
+      <w:r>
+        <w:rPr>
+          <w:b/>
+          <w:bCs/>
+          <w:color w:val="000000"/>
+          <w:sz w:val="20"/>
+          <w:szCs w:val="20"/>
+        </w:rPr>
+        <w:t>screen_id</w:t>
+      </w:r>
+      <w:proofErr w:type="spellEnd"/>
+      <w:r>
+        <w:rPr>
+          <w:b/>
+          <w:bCs/>
+          <w:color w:val="000000"/>
+          <w:sz w:val="20"/>
+          <w:szCs w:val="20"/>
+        </w:rPr>
+        <w:t xml:space="preserve">, </w:t>
+      </w:r>
+      <w:proofErr w:type="spellStart"/>
+      <w:r>
+        <w:rPr>
+          <w:b/>
+          <w:bCs/>
+          <w:color w:val="000000"/>
+          <w:sz w:val="20"/>
+          <w:szCs w:val="20"/>
+        </w:rPr>
+        <w:t>seat_number</w:t>
+      </w:r>
+      <w:proofErr w:type="spellEnd"/>
+      <w:r>
+        <w:rPr>
+          <w:b/>
+          <w:bCs/>
+          <w:color w:val="000000"/>
+          <w:sz w:val="20"/>
+          <w:szCs w:val="20"/>
+        </w:rPr>
+        <w:t>),</w:t>
+      </w:r>
+    </w:p>
+    <w:p>
+      <w:pPr>
+        <w:widowControl/>
+        <w:pBdr>
+          <w:top w:val="nil"/>
+          <w:left w:val="nil"/>
+          <w:bottom w:val="nil"/>
+          <w:right w:val="nil"/>
+          <w:between w:val="nil"/>
+        </w:pBdr>
+        <w:rPr>
+          <w:b/>
+          <w:bCs/>
+          <w:color w:val="000000"/>
+          <w:sz w:val="20"/>
+          <w:szCs w:val="20"/>
+        </w:rPr>
+      </w:pPr>
+      <w:r>
+        <w:rPr>
+          <w:b/>
+          <w:bCs/>
+          <w:color w:val="000000"/>
+          <w:sz w:val="20"/>
+          <w:szCs w:val="20"/>
+        </w:rPr>
+        <w:t xml:space="preserve">    FOREIGN KEY (</w:t>
+      </w:r>
+      <w:proofErr w:type="spellStart"/>
+      <w:r>
+        <w:rPr>
+          <w:b/>
+          <w:bCs/>
+          <w:color w:val="000000"/>
+          <w:sz w:val="20"/>
+          <w:szCs w:val="20"/>
+        </w:rPr>
+        <w:t>screen_id</w:t>
+      </w:r>
+      <w:proofErr w:type="spellEnd"/>
+      <w:r>
+        <w:rPr>
+          <w:b/>
+          <w:bCs/>
+          <w:color w:val="000000"/>
+          <w:sz w:val="20"/>
+          <w:szCs w:val="20"/>
+        </w:rPr>
+        <w:t>)</w:t>
+      </w:r>
+    </w:p>
+    <w:p>
+      <w:pPr>
+        <w:widowControl/>
+        <w:pBdr>
+          <w:top w:val="nil"/>
+          <w:left w:val="nil"/>
+          <w:bottom w:val="nil"/>
+          <w:right w:val="nil"/>
+          <w:between w:val="nil"/>
+        </w:pBdr>
+        <w:rPr>
+          <w:b/>
+          <w:bCs/>
+          <w:color w:val="000000"/>
+          <w:sz w:val="20"/>
+          <w:szCs w:val="20"/>
+        </w:rPr>
+      </w:pPr>
+      <w:r>
+        <w:rPr>
+          <w:b/>
+          <w:bCs/>
+          <w:color w:val="000000"/>
+          <w:sz w:val="20"/>
+          <w:szCs w:val="20"/>
+        </w:rPr>
+        <w:t xml:space="preserve">        REFERENCES </w:t>
+      </w:r>
+      <w:proofErr w:type="gramStart"/>
+      <w:r>
+        <w:rPr>
+          <w:b/>
+          <w:bCs/>
+          <w:color w:val="000000"/>
+          <w:sz w:val="20"/>
+          <w:szCs w:val="20"/>
+        </w:rPr>
+        <w:t>SCREEN(</w:t>
+      </w:r>
+      <w:proofErr w:type="spellStart"/>
+      <w:proofErr w:type="gramEnd"/>
+      <w:r>
+        <w:rPr>
+          <w:b/>
+          <w:bCs/>
+          <w:color w:val="000000"/>
+          <w:sz w:val="20"/>
+          <w:szCs w:val="20"/>
+        </w:rPr>
+        <w:t>screen_id</w:t>
+      </w:r>
+      <w:proofErr w:type="spellEnd"/>
+      <w:r>
+        <w:rPr>
+          <w:b/>
+          <w:bCs/>
+          <w:color w:val="000000"/>
+          <w:sz w:val="20"/>
+          <w:szCs w:val="20"/>
+        </w:rPr>
+        <w:t>)</w:t>
       </w:r>
     </w:p>
     <w:p>
@@ -2274,6 +3108,7 @@
         <w:rPr>
           <w:b/>
           <w:bCs/>
+          <w:noProof/>
           <w:color w:val="000000"/>
           <w:sz w:val="20"/>
           <w:szCs w:val="20"/>
@@ -2389,123 +3224,255 @@
           <w:sz w:val="20"/>
           <w:szCs w:val="20"/>
         </w:rPr>
-        <w:t xml:space="preserve">    customer_id INT PRIMARY KEY,</w:t>
-      </w:r>
-    </w:p>
-    <w:p>
-      <w:pPr>
-        <w:widowControl/>
-        <w:pBdr>
-          <w:top w:val="nil"/>
-          <w:left w:val="nil"/>
-          <w:bottom w:val="nil"/>
-          <w:right w:val="nil"/>
-          <w:between w:val="nil"/>
-        </w:pBdr>
-        <w:rPr>
-          <w:b/>
-          <w:bCs/>
-          <w:color w:val="000000"/>
-          <w:sz w:val="20"/>
-          <w:szCs w:val="20"/>
-        </w:rPr>
-      </w:pPr>
-      <w:r>
-        <w:rPr>
-          <w:b/>
-          <w:bCs/>
-          <w:color w:val="000000"/>
-          <w:sz w:val="20"/>
-          <w:szCs w:val="20"/>
-        </w:rPr>
-        <w:t xml:space="preserve">    customer_name VARCHAR(50) NOT NULL,</w:t>
-      </w:r>
-    </w:p>
-    <w:p>
-      <w:pPr>
-        <w:widowControl/>
-        <w:pBdr>
-          <w:top w:val="nil"/>
-          <w:left w:val="nil"/>
-          <w:bottom w:val="nil"/>
-          <w:right w:val="nil"/>
-          <w:between w:val="nil"/>
-        </w:pBdr>
-        <w:rPr>
-          <w:b/>
-          <w:bCs/>
-          <w:color w:val="000000"/>
-          <w:sz w:val="20"/>
-          <w:szCs w:val="20"/>
-        </w:rPr>
-      </w:pPr>
-      <w:r>
-        <w:rPr>
-          <w:b/>
-          <w:bCs/>
-          <w:color w:val="000000"/>
-          <w:sz w:val="20"/>
-          <w:szCs w:val="20"/>
-        </w:rPr>
-        <w:t xml:space="preserve">    email VARCHAR(50) UNIQUE,</w:t>
-      </w:r>
-    </w:p>
-    <w:p>
-      <w:pPr>
-        <w:widowControl/>
-        <w:pBdr>
-          <w:top w:val="nil"/>
-          <w:left w:val="nil"/>
-          <w:bottom w:val="nil"/>
-          <w:right w:val="nil"/>
-          <w:between w:val="nil"/>
-        </w:pBdr>
-        <w:rPr>
-          <w:b/>
-          <w:bCs/>
-          <w:color w:val="000000"/>
-          <w:sz w:val="20"/>
-          <w:szCs w:val="20"/>
-        </w:rPr>
-      </w:pPr>
-      <w:r>
-        <w:rPr>
-          <w:b/>
-          <w:bCs/>
-          <w:color w:val="000000"/>
-          <w:sz w:val="20"/>
-          <w:szCs w:val="20"/>
-        </w:rPr>
-        <w:t xml:space="preserve">    phone VARCHAR(15),</w:t>
-      </w:r>
-    </w:p>
-    <w:p>
-      <w:pPr>
-        <w:widowControl/>
-        <w:pBdr>
-          <w:top w:val="nil"/>
-          <w:left w:val="nil"/>
-          <w:bottom w:val="nil"/>
-          <w:right w:val="nil"/>
-          <w:between w:val="nil"/>
-        </w:pBdr>
-        <w:rPr>
-          <w:b/>
-          <w:bCs/>
-          <w:color w:val="000000"/>
-          <w:sz w:val="20"/>
-          <w:szCs w:val="20"/>
-        </w:rPr>
-      </w:pPr>
-      <w:r>
-        <w:rPr>
-          <w:b/>
-          <w:bCs/>
-          <w:color w:val="000000"/>
-          <w:sz w:val="20"/>
-          <w:szCs w:val="20"/>
-        </w:rPr>
-        <w:t xml:space="preserve">    city VARCHAR(30)</w:t>
+        <w:t xml:space="preserve">    </w:t>
+      </w:r>
+      <w:proofErr w:type="spellStart"/>
+      <w:r>
+        <w:rPr>
+          <w:b/>
+          <w:bCs/>
+          <w:color w:val="000000"/>
+          <w:sz w:val="20"/>
+          <w:szCs w:val="20"/>
+        </w:rPr>
+        <w:t>customer_id</w:t>
+      </w:r>
+      <w:proofErr w:type="spellEnd"/>
+      <w:r>
+        <w:rPr>
+          <w:b/>
+          <w:bCs/>
+          <w:color w:val="000000"/>
+          <w:sz w:val="20"/>
+          <w:szCs w:val="20"/>
+        </w:rPr>
+        <w:t xml:space="preserve"> INT PRIMARY KEY,</w:t>
+      </w:r>
+    </w:p>
+    <w:p>
+      <w:pPr>
+        <w:widowControl/>
+        <w:pBdr>
+          <w:top w:val="nil"/>
+          <w:left w:val="nil"/>
+          <w:bottom w:val="nil"/>
+          <w:right w:val="nil"/>
+          <w:between w:val="nil"/>
+        </w:pBdr>
+        <w:rPr>
+          <w:b/>
+          <w:bCs/>
+          <w:color w:val="000000"/>
+          <w:sz w:val="20"/>
+          <w:szCs w:val="20"/>
+        </w:rPr>
+      </w:pPr>
+      <w:r>
+        <w:rPr>
+          <w:b/>
+          <w:bCs/>
+          <w:color w:val="000000"/>
+          <w:sz w:val="20"/>
+          <w:szCs w:val="20"/>
+        </w:rPr>
+        <w:t xml:space="preserve">    </w:t>
+      </w:r>
+      <w:proofErr w:type="spellStart"/>
+      <w:r>
+        <w:rPr>
+          <w:b/>
+          <w:bCs/>
+          <w:color w:val="000000"/>
+          <w:sz w:val="20"/>
+          <w:szCs w:val="20"/>
+        </w:rPr>
+        <w:t>customer_name</w:t>
+      </w:r>
+      <w:proofErr w:type="spellEnd"/>
+      <w:r>
+        <w:rPr>
+          <w:b/>
+          <w:bCs/>
+          <w:color w:val="000000"/>
+          <w:sz w:val="20"/>
+          <w:szCs w:val="20"/>
+        </w:rPr>
+        <w:t xml:space="preserve"> </w:t>
+      </w:r>
+      <w:proofErr w:type="gramStart"/>
+      <w:r>
+        <w:rPr>
+          <w:b/>
+          <w:bCs/>
+          <w:color w:val="000000"/>
+          <w:sz w:val="20"/>
+          <w:szCs w:val="20"/>
+        </w:rPr>
+        <w:t>VARCHAR(</w:t>
+      </w:r>
+      <w:proofErr w:type="gramEnd"/>
+      <w:r>
+        <w:rPr>
+          <w:b/>
+          <w:bCs/>
+          <w:color w:val="000000"/>
+          <w:sz w:val="20"/>
+          <w:szCs w:val="20"/>
+        </w:rPr>
+        <w:t>50) NOT NULL,</w:t>
+      </w:r>
+    </w:p>
+    <w:p>
+      <w:pPr>
+        <w:widowControl/>
+        <w:pBdr>
+          <w:top w:val="nil"/>
+          <w:left w:val="nil"/>
+          <w:bottom w:val="nil"/>
+          <w:right w:val="nil"/>
+          <w:between w:val="nil"/>
+        </w:pBdr>
+        <w:rPr>
+          <w:b/>
+          <w:bCs/>
+          <w:color w:val="000000"/>
+          <w:sz w:val="20"/>
+          <w:szCs w:val="20"/>
+        </w:rPr>
+      </w:pPr>
+      <w:r>
+        <w:rPr>
+          <w:b/>
+          <w:bCs/>
+          <w:color w:val="000000"/>
+          <w:sz w:val="20"/>
+          <w:szCs w:val="20"/>
+        </w:rPr>
+        <w:t xml:space="preserve">    email </w:t>
+      </w:r>
+      <w:proofErr w:type="gramStart"/>
+      <w:r>
+        <w:rPr>
+          <w:b/>
+          <w:bCs/>
+          <w:color w:val="000000"/>
+          <w:sz w:val="20"/>
+          <w:szCs w:val="20"/>
+        </w:rPr>
+        <w:t>VARCHAR(</w:t>
+      </w:r>
+      <w:proofErr w:type="gramEnd"/>
+      <w:r>
+        <w:rPr>
+          <w:b/>
+          <w:bCs/>
+          <w:color w:val="000000"/>
+          <w:sz w:val="20"/>
+          <w:szCs w:val="20"/>
+        </w:rPr>
+        <w:t>50) UNIQUE,</w:t>
+      </w:r>
+    </w:p>
+    <w:p>
+      <w:pPr>
+        <w:widowControl/>
+        <w:pBdr>
+          <w:top w:val="nil"/>
+          <w:left w:val="nil"/>
+          <w:bottom w:val="nil"/>
+          <w:right w:val="nil"/>
+          <w:between w:val="nil"/>
+        </w:pBdr>
+        <w:rPr>
+          <w:b/>
+          <w:bCs/>
+          <w:color w:val="000000"/>
+          <w:sz w:val="20"/>
+          <w:szCs w:val="20"/>
+        </w:rPr>
+      </w:pPr>
+      <w:r>
+        <w:rPr>
+          <w:b/>
+          <w:bCs/>
+          <w:color w:val="000000"/>
+          <w:sz w:val="20"/>
+          <w:szCs w:val="20"/>
+        </w:rPr>
+        <w:t xml:space="preserve">    phone </w:t>
+      </w:r>
+      <w:proofErr w:type="gramStart"/>
+      <w:r>
+        <w:rPr>
+          <w:b/>
+          <w:bCs/>
+          <w:color w:val="000000"/>
+          <w:sz w:val="20"/>
+          <w:szCs w:val="20"/>
+        </w:rPr>
+        <w:t>VARCHAR(</w:t>
+      </w:r>
+      <w:proofErr w:type="gramEnd"/>
+      <w:r>
+        <w:rPr>
+          <w:b/>
+          <w:bCs/>
+          <w:color w:val="000000"/>
+          <w:sz w:val="20"/>
+          <w:szCs w:val="20"/>
+        </w:rPr>
+        <w:t>15),</w:t>
+      </w:r>
+    </w:p>
+    <w:p>
+      <w:pPr>
+        <w:widowControl/>
+        <w:pBdr>
+          <w:top w:val="nil"/>
+          <w:left w:val="nil"/>
+          <w:bottom w:val="nil"/>
+          <w:right w:val="nil"/>
+          <w:between w:val="nil"/>
+        </w:pBdr>
+        <w:rPr>
+          <w:b/>
+          <w:bCs/>
+          <w:color w:val="000000"/>
+          <w:sz w:val="20"/>
+          <w:szCs w:val="20"/>
+        </w:rPr>
+      </w:pPr>
+      <w:r>
+        <w:rPr>
+          <w:b/>
+          <w:bCs/>
+          <w:color w:val="000000"/>
+          <w:sz w:val="20"/>
+          <w:szCs w:val="20"/>
+        </w:rPr>
+        <w:t xml:space="preserve">    city </w:t>
+      </w:r>
+      <w:proofErr w:type="gramStart"/>
+      <w:r>
+        <w:rPr>
+          <w:b/>
+          <w:bCs/>
+          <w:color w:val="000000"/>
+          <w:sz w:val="20"/>
+          <w:szCs w:val="20"/>
+        </w:rPr>
+        <w:t>VARCHAR(</w:t>
+      </w:r>
+      <w:proofErr w:type="gramEnd"/>
+      <w:r>
+        <w:rPr>
+          <w:b/>
+          <w:bCs/>
+          <w:color w:val="000000"/>
+          <w:sz w:val="20"/>
+          <w:szCs w:val="20"/>
+        </w:rPr>
+        <w:t>30)</w:t>
       </w:r>
     </w:p>
     <w:p>
@@ -2574,6 +3541,7 @@
       </w:pPr>
       <w:r>
         <w:rPr>
+          <w:noProof/>
           <w:color w:val="000000"/>
           <w:sz w:val="24"/>
           <w:szCs w:val="24"/>
@@ -2716,68 +3684,6 @@
           <w:lang w:val="en-IN"/>
         </w:rPr>
       </w:pPr>
-      <w:r>
-        <w:rPr>
-          <w:b/>
-          <w:bCs/>
-          <w:color w:val="000000"/>
-          <w:sz w:val="20"/>
-          <w:szCs w:val="20"/>
-          <w:lang w:val="en-IN"/>
-        </w:rPr>
-        <w:t>A. Add a column</w:t>
-      </w:r>
-    </w:p>
-    <w:p>
-      <w:pPr>
-        <w:widowControl/>
-        <w:pBdr>
-          <w:top w:val="nil"/>
-          <w:left w:val="nil"/>
-          <w:bottom w:val="nil"/>
-          <w:right w:val="nil"/>
-          <w:between w:val="nil"/>
-        </w:pBdr>
-        <w:rPr>
-          <w:b/>
-          <w:bCs/>
-          <w:color w:val="000000"/>
-          <w:sz w:val="20"/>
-          <w:szCs w:val="20"/>
-          <w:lang w:val="en-IN"/>
-        </w:rPr>
-      </w:pPr>
-      <w:r>
-        <w:rPr>
-          <w:b/>
-          <w:bCs/>
-          <w:color w:val="000000"/>
-          <w:sz w:val="20"/>
-          <w:szCs w:val="20"/>
-          <w:lang w:val="en-IN"/>
-        </w:rPr>
-        <w:t>Add a remarks column to Scheme_Details.</w:t>
-      </w:r>
-    </w:p>
-    <w:p>
-      <w:pPr>
-        <w:widowControl/>
-        <w:pBdr>
-          <w:top w:val="nil"/>
-          <w:left w:val="nil"/>
-          <w:bottom w:val="nil"/>
-          <w:right w:val="nil"/>
-          <w:between w:val="nil"/>
-        </w:pBdr>
-        <w:rPr>
-          <w:b/>
-          <w:bCs/>
-          <w:color w:val="000000"/>
-          <w:sz w:val="20"/>
-          <w:szCs w:val="20"/>
-          <w:lang w:val="en-IN"/>
-        </w:rPr>
-      </w:pPr>
     </w:p>
     <w:p>
       <w:pPr>
@@ -2822,7 +3728,23 @@
           <w:color w:val="000000"/>
           <w:lang w:val="en-IN"/>
         </w:rPr>
-        <w:t>ADD remarks VARCHAR(100);</w:t>
+        <w:t xml:space="preserve">ADD remarks </w:t>
+      </w:r>
+      <w:proofErr w:type="gramStart"/>
+      <w:r>
+        <w:rPr>
+          <w:color w:val="000000"/>
+          <w:lang w:val="en-IN"/>
+        </w:rPr>
+        <w:t>VARCHAR(</w:t>
+      </w:r>
+      <w:proofErr w:type="gramEnd"/>
+      <w:r>
+        <w:rPr>
+          <w:color w:val="000000"/>
+          <w:lang w:val="en-IN"/>
+        </w:rPr>
+        <w:t>100);</w:t>
       </w:r>
     </w:p>
     <w:p>
@@ -2847,6 +3769,7 @@
         <w:rPr>
           <w:b/>
           <w:bCs/>
+          <w:noProof/>
           <w:color w:val="000000"/>
           <w:sz w:val="28"/>
           <w:szCs w:val="28"/>
@@ -3036,27 +3959,44 @@
           <w:color w:val="000000"/>
           <w:lang w:val="en-IN"/>
         </w:rPr>
-        <w:t>MODIFY COLUMN title VARCHAR(100);</w:t>
-      </w:r>
-    </w:p>
-    <w:p>
-      <w:pPr>
-        <w:widowControl/>
-        <w:pBdr>
-          <w:top w:val="nil"/>
-          <w:left w:val="nil"/>
-          <w:bottom w:val="nil"/>
-          <w:right w:val="nil"/>
-          <w:between w:val="nil"/>
-        </w:pBdr>
-        <w:rPr>
-          <w:color w:val="000000"/>
-          <w:sz w:val="24"/>
-          <w:szCs w:val="24"/>
-        </w:rPr>
-      </w:pPr>
-      <w:r>
-        <w:rPr>
+        <w:t xml:space="preserve">MODIFY COLUMN title </w:t>
+      </w:r>
+      <w:proofErr w:type="gramStart"/>
+      <w:r>
+        <w:rPr>
+          <w:color w:val="000000"/>
+          <w:lang w:val="en-IN"/>
+        </w:rPr>
+        <w:t>VARCHAR(</w:t>
+      </w:r>
+      <w:proofErr w:type="gramEnd"/>
+      <w:r>
+        <w:rPr>
+          <w:color w:val="000000"/>
+          <w:lang w:val="en-IN"/>
+        </w:rPr>
+        <w:t>100);</w:t>
+      </w:r>
+    </w:p>
+    <w:p>
+      <w:pPr>
+        <w:widowControl/>
+        <w:pBdr>
+          <w:top w:val="nil"/>
+          <w:left w:val="nil"/>
+          <w:bottom w:val="nil"/>
+          <w:right w:val="nil"/>
+          <w:between w:val="nil"/>
+        </w:pBdr>
+        <w:rPr>
+          <w:color w:val="000000"/>
+          <w:sz w:val="24"/>
+          <w:szCs w:val="24"/>
+        </w:rPr>
+      </w:pPr>
+      <w:r>
+        <w:rPr>
+          <w:noProof/>
           <w:color w:val="000000"/>
           <w:sz w:val="24"/>
           <w:szCs w:val="24"/>
@@ -3109,339 +4049,220 @@
           <w:between w:val="nil"/>
         </w:pBdr>
         <w:rPr>
-          <w:b/>
-          <w:bCs/>
-          <w:color w:val="000000"/>
-          <w:lang w:val="en-IN"/>
-        </w:rPr>
-      </w:pPr>
-      <w:r>
-        <w:rPr>
-          <w:b/>
-          <w:bCs/>
-          <w:color w:val="000000"/>
-          <w:lang w:val="en-IN"/>
-        </w:rPr>
-        <w:t>C. Rename a column</w:t>
-      </w:r>
-    </w:p>
-    <w:p>
-      <w:pPr>
-        <w:widowControl/>
-        <w:pBdr>
-          <w:top w:val="nil"/>
-          <w:left w:val="nil"/>
-          <w:bottom w:val="nil"/>
-          <w:right w:val="nil"/>
-          <w:between w:val="nil"/>
-        </w:pBdr>
-        <w:rPr>
-          <w:b/>
-          <w:bCs/>
-          <w:color w:val="000000"/>
-        </w:rPr>
-      </w:pPr>
-      <w:r>
-        <w:rPr>
-          <w:b/>
-          <w:bCs/>
-          <w:color w:val="000000"/>
-        </w:rPr>
-        <w:t>Rename the genre column to movie_genre.</w:t>
-      </w:r>
-    </w:p>
-    <w:p>
-      <w:pPr>
-        <w:widowControl/>
-        <w:pBdr>
-          <w:top w:val="nil"/>
-          <w:left w:val="nil"/>
-          <w:bottom w:val="nil"/>
-          <w:right w:val="nil"/>
-          <w:between w:val="nil"/>
-        </w:pBdr>
-        <w:rPr>
-          <w:b/>
-          <w:bCs/>
-          <w:color w:val="000000"/>
-          <w:lang w:val="en-IN"/>
-        </w:rPr>
-      </w:pPr>
-    </w:p>
-    <w:p>
-      <w:pPr>
-        <w:widowControl/>
-        <w:pBdr>
-          <w:top w:val="nil"/>
-          <w:left w:val="nil"/>
-          <w:bottom w:val="nil"/>
-          <w:right w:val="nil"/>
-          <w:between w:val="nil"/>
-        </w:pBdr>
-        <w:rPr>
-          <w:color w:val="000000"/>
-          <w:lang w:val="en-IN"/>
-        </w:rPr>
-      </w:pPr>
-      <w:r>
-        <w:rPr>
-          <w:color w:val="000000"/>
-          <w:lang w:val="en-IN"/>
-        </w:rPr>
-        <w:t>ALTER TABLE List_Of_State2</w:t>
-      </w:r>
-    </w:p>
-    <w:p>
-      <w:pPr>
-        <w:widowControl/>
-        <w:pBdr>
-          <w:top w:val="nil"/>
-          <w:left w:val="nil"/>
-          <w:bottom w:val="nil"/>
-          <w:right w:val="nil"/>
-          <w:between w:val="nil"/>
-        </w:pBdr>
-        <w:rPr>
-          <w:color w:val="000000"/>
-          <w:lang w:val="en-IN"/>
-        </w:rPr>
-      </w:pPr>
-      <w:r>
-        <w:rPr>
-          <w:color w:val="000000"/>
-          <w:lang w:val="en-IN"/>
-        </w:rPr>
-        <w:t>RENAME COLUMN scode TO state_code;</w:t>
-      </w:r>
-    </w:p>
-    <w:p>
-      <w:pPr>
-        <w:widowControl/>
-        <w:pBdr>
-          <w:top w:val="nil"/>
-          <w:left w:val="nil"/>
-          <w:bottom w:val="nil"/>
-          <w:right w:val="nil"/>
-          <w:between w:val="nil"/>
-        </w:pBdr>
-        <w:rPr>
-          <w:color w:val="000000"/>
-          <w:sz w:val="24"/>
-          <w:szCs w:val="24"/>
+          <w:color w:val="000000"/>
+          <w:sz w:val="24"/>
+          <w:szCs w:val="24"/>
+        </w:rPr>
+      </w:pPr>
+    </w:p>
+    <w:p>
+      <w:pPr>
+        <w:widowControl/>
+        <w:pBdr>
+          <w:top w:val="nil"/>
+          <w:left w:val="nil"/>
+          <w:bottom w:val="nil"/>
+          <w:right w:val="nil"/>
+          <w:between w:val="nil"/>
+        </w:pBdr>
+        <w:rPr>
+          <w:color w:val="000000"/>
+          <w:sz w:val="24"/>
+          <w:szCs w:val="24"/>
+        </w:rPr>
+      </w:pPr>
+    </w:p>
+    <w:p>
+      <w:pPr>
+        <w:widowControl/>
+        <w:pBdr>
+          <w:top w:val="nil"/>
+          <w:left w:val="nil"/>
+          <w:bottom w:val="nil"/>
+          <w:right w:val="nil"/>
+          <w:between w:val="nil"/>
+        </w:pBdr>
+        <w:rPr>
+          <w:b/>
+          <w:bCs/>
+          <w:color w:val="000000"/>
+          <w:lang w:val="en-IN"/>
+        </w:rPr>
+      </w:pPr>
+      <w:r>
+        <w:rPr>
+          <w:b/>
+          <w:bCs/>
+          <w:color w:val="000000"/>
+          <w:lang w:val="en-IN"/>
+        </w:rPr>
+        <w:t>D. Drop a column</w:t>
+      </w:r>
+    </w:p>
+    <w:p>
+      <w:pPr>
+        <w:widowControl/>
+        <w:pBdr>
+          <w:top w:val="nil"/>
+          <w:left w:val="nil"/>
+          <w:bottom w:val="nil"/>
+          <w:right w:val="nil"/>
+          <w:between w:val="nil"/>
+        </w:pBdr>
+        <w:rPr>
+          <w:b/>
+          <w:bCs/>
+          <w:color w:val="000000"/>
+          <w:lang w:val="en-IN"/>
+        </w:rPr>
+      </w:pPr>
+      <w:r>
+        <w:rPr>
+          <w:b/>
+          <w:bCs/>
+          <w:color w:val="000000"/>
+          <w:lang w:val="en-IN"/>
+        </w:rPr>
+        <w:t xml:space="preserve">Remove the remarks column from </w:t>
+      </w:r>
+      <w:proofErr w:type="spellStart"/>
+      <w:r>
+        <w:rPr>
+          <w:b/>
+          <w:bCs/>
+          <w:color w:val="000000"/>
+          <w:lang w:val="en-IN"/>
+        </w:rPr>
+        <w:t>Movie_details</w:t>
+      </w:r>
+      <w:proofErr w:type="spellEnd"/>
+    </w:p>
+    <w:p>
+      <w:pPr>
+        <w:widowControl/>
+        <w:pBdr>
+          <w:top w:val="nil"/>
+          <w:left w:val="nil"/>
+          <w:bottom w:val="nil"/>
+          <w:right w:val="nil"/>
+          <w:between w:val="nil"/>
+        </w:pBdr>
+        <w:rPr>
+          <w:b/>
+          <w:bCs/>
+          <w:color w:val="000000"/>
+          <w:lang w:val="en-IN"/>
+        </w:rPr>
+      </w:pPr>
+    </w:p>
+    <w:p>
+      <w:pPr>
+        <w:widowControl/>
+        <w:pBdr>
+          <w:top w:val="nil"/>
+          <w:left w:val="nil"/>
+          <w:bottom w:val="nil"/>
+          <w:right w:val="nil"/>
+          <w:between w:val="nil"/>
+        </w:pBdr>
+        <w:rPr>
+          <w:color w:val="000000"/>
+          <w:lang w:val="en-IN"/>
+        </w:rPr>
+      </w:pPr>
+      <w:r>
+        <w:rPr>
+          <w:color w:val="000000"/>
+          <w:lang w:val="en-IN"/>
+        </w:rPr>
+        <w:t xml:space="preserve">ALTER TABLE </w:t>
+      </w:r>
+      <w:proofErr w:type="spellStart"/>
+      <w:r>
+        <w:rPr>
+          <w:color w:val="000000"/>
+          <w:lang w:val="en-IN"/>
+        </w:rPr>
+        <w:t>movie_details</w:t>
+      </w:r>
+      <w:proofErr w:type="spellEnd"/>
+    </w:p>
+    <w:p>
+      <w:pPr>
+        <w:widowControl/>
+        <w:pBdr>
+          <w:top w:val="nil"/>
+          <w:left w:val="nil"/>
+          <w:bottom w:val="nil"/>
+          <w:right w:val="nil"/>
+          <w:between w:val="nil"/>
+        </w:pBdr>
+        <w:rPr>
+          <w:color w:val="000000"/>
+          <w:lang w:val="en-IN"/>
+        </w:rPr>
+      </w:pPr>
+      <w:r>
+        <w:rPr>
+          <w:color w:val="000000"/>
+          <w:lang w:val="en-IN"/>
+        </w:rPr>
+        <w:t xml:space="preserve">ADD remarks </w:t>
+      </w:r>
+      <w:proofErr w:type="gramStart"/>
+      <w:r>
+        <w:rPr>
+          <w:color w:val="000000"/>
+          <w:lang w:val="en-IN"/>
+        </w:rPr>
+        <w:t>VARCHAR(</w:t>
+      </w:r>
+      <w:proofErr w:type="gramEnd"/>
+      <w:r>
+        <w:rPr>
+          <w:color w:val="000000"/>
+          <w:lang w:val="en-IN"/>
+        </w:rPr>
+        <w:t>100);</w:t>
+      </w:r>
+    </w:p>
+    <w:p>
+      <w:pPr>
+        <w:widowControl/>
+        <w:pBdr>
+          <w:top w:val="nil"/>
+          <w:left w:val="nil"/>
+          <w:bottom w:val="nil"/>
+          <w:right w:val="nil"/>
+          <w:between w:val="nil"/>
+        </w:pBdr>
+        <w:rPr>
+          <w:color w:val="000000"/>
+          <w:lang w:val="en-IN"/>
+        </w:rPr>
+      </w:pPr>
+    </w:p>
+    <w:p>
+      <w:pPr>
+        <w:widowControl/>
+        <w:pBdr>
+          <w:top w:val="nil"/>
+          <w:left w:val="nil"/>
+          <w:bottom w:val="nil"/>
+          <w:right w:val="nil"/>
+          <w:between w:val="nil"/>
+        </w:pBdr>
+        <w:rPr>
+          <w:color w:val="000000"/>
+          <w:lang w:val="en-IN"/>
         </w:rPr>
       </w:pPr>
       <w:r>
         <w:rPr>
           <w:noProof/>
           <w:color w:val="000000"/>
-          <w:sz w:val="24"/>
-          <w:szCs w:val="24"/>
-          <w14:ligatures w14:val="standardContextual"/>
-        </w:rPr>
-        <w:drawing>
-          <wp:inline distT="0" distB="0" distL="0" distR="0" wp14:anchorId="3417DF37" wp14:editId="49B4C690">
-            <wp:extent cx="5731510" cy="1916430"/>
-            <wp:effectExtent l="19050" t="19050" r="21590" b="26670"/>
-            <wp:docPr id="1224498952" name="Picture 13"/>
-            <wp:cNvGraphicFramePr>
-              <a:graphicFrameLocks xmlns:a="http://schemas.openxmlformats.org/drawingml/2006/main" noChangeAspect="1"/>
-            </wp:cNvGraphicFramePr>
-            <a:graphic xmlns:a="http://schemas.openxmlformats.org/drawingml/2006/main">
-              <a:graphicData uri="http://schemas.openxmlformats.org/drawingml/2006/picture">
-                <pic:pic xmlns:pic="http://schemas.openxmlformats.org/drawingml/2006/picture">
-                  <pic:nvPicPr>
-                    <pic:cNvPr id="1224498952" name="Picture 1224498952"/>
-                    <pic:cNvPicPr/>
-                  </pic:nvPicPr>
-                  <pic:blipFill>
-                    <a:blip r:embed="rId13" cstate="print">
-                      <a:extLst>
-                        <a:ext uri="{28A0092B-C50C-407E-A947-70E740481C1C}">
-                          <a14:useLocalDpi xmlns:a14="http://schemas.microsoft.com/office/drawing/2010/main" val="0"/>
-                        </a:ext>
-                      </a:extLst>
-                    </a:blip>
-                    <a:stretch>
-                      <a:fillRect/>
-                    </a:stretch>
-                  </pic:blipFill>
-                  <pic:spPr>
-                    <a:xfrm>
-                      <a:off x="0" y="0"/>
-                      <a:ext cx="5731510" cy="1916430"/>
-                    </a:xfrm>
-                    <a:prstGeom prst="rect">
-                      <a:avLst/>
-                    </a:prstGeom>
-                    <a:ln>
-                      <a:solidFill>
-                        <a:schemeClr val="tx1"/>
-                      </a:solidFill>
-                    </a:ln>
-                  </pic:spPr>
-                </pic:pic>
-              </a:graphicData>
-            </a:graphic>
-          </wp:inline>
-        </w:drawing>
-      </w:r>
-    </w:p>
-    <w:p>
-      <w:pPr>
-        <w:widowControl/>
-        <w:pBdr>
-          <w:top w:val="nil"/>
-          <w:left w:val="nil"/>
-          <w:bottom w:val="nil"/>
-          <w:right w:val="nil"/>
-          <w:between w:val="nil"/>
-        </w:pBdr>
-        <w:rPr>
-          <w:color w:val="000000"/>
-          <w:sz w:val="24"/>
-          <w:szCs w:val="24"/>
-        </w:rPr>
-      </w:pPr>
-    </w:p>
-    <w:p>
-      <w:pPr>
-        <w:widowControl/>
-        <w:pBdr>
-          <w:top w:val="nil"/>
-          <w:left w:val="nil"/>
-          <w:bottom w:val="nil"/>
-          <w:right w:val="nil"/>
-          <w:between w:val="nil"/>
-        </w:pBdr>
-        <w:rPr>
-          <w:b/>
-          <w:bCs/>
-          <w:color w:val="000000"/>
-          <w:lang w:val="en-IN"/>
-        </w:rPr>
-      </w:pPr>
-      <w:r>
-        <w:rPr>
-          <w:b/>
-          <w:bCs/>
-          <w:color w:val="000000"/>
-          <w:lang w:val="en-IN"/>
-        </w:rPr>
-        <w:t>D. Drop a column</w:t>
-      </w:r>
-    </w:p>
-    <w:p>
-      <w:pPr>
-        <w:widowControl/>
-        <w:pBdr>
-          <w:top w:val="nil"/>
-          <w:left w:val="nil"/>
-          <w:bottom w:val="nil"/>
-          <w:right w:val="nil"/>
-          <w:between w:val="nil"/>
-        </w:pBdr>
-        <w:rPr>
-          <w:b/>
-          <w:bCs/>
-          <w:color w:val="000000"/>
-          <w:lang w:val="en-IN"/>
-        </w:rPr>
-      </w:pPr>
-      <w:r>
-        <w:rPr>
-          <w:b/>
-          <w:bCs/>
-          <w:color w:val="000000"/>
-          <w:lang w:val="en-IN"/>
-        </w:rPr>
-        <w:t>Remove the remarks column from Scheme_Details.</w:t>
-      </w:r>
-    </w:p>
-    <w:p>
-      <w:pPr>
-        <w:widowControl/>
-        <w:pBdr>
-          <w:top w:val="nil"/>
-          <w:left w:val="nil"/>
-          <w:bottom w:val="nil"/>
-          <w:right w:val="nil"/>
-          <w:between w:val="nil"/>
-        </w:pBdr>
-        <w:rPr>
-          <w:b/>
-          <w:bCs/>
-          <w:color w:val="000000"/>
-          <w:lang w:val="en-IN"/>
-        </w:rPr>
-      </w:pPr>
-    </w:p>
-    <w:p>
-      <w:pPr>
-        <w:widowControl/>
-        <w:pBdr>
-          <w:top w:val="nil"/>
-          <w:left w:val="nil"/>
-          <w:bottom w:val="nil"/>
-          <w:right w:val="nil"/>
-          <w:between w:val="nil"/>
-        </w:pBdr>
-        <w:rPr>
-          <w:color w:val="000000"/>
-          <w:lang w:val="en-IN"/>
-        </w:rPr>
-      </w:pPr>
-      <w:r>
-        <w:rPr>
-          <w:color w:val="000000"/>
-          <w:lang w:val="en-IN"/>
-        </w:rPr>
-        <w:t>ALTER TABLE Scheme_Details</w:t>
-      </w:r>
-    </w:p>
-    <w:p>
-      <w:pPr>
-        <w:widowControl/>
-        <w:pBdr>
-          <w:top w:val="nil"/>
-          <w:left w:val="nil"/>
-          <w:bottom w:val="nil"/>
-          <w:right w:val="nil"/>
-          <w:between w:val="nil"/>
-        </w:pBdr>
-        <w:rPr>
-          <w:color w:val="000000"/>
-          <w:lang w:val="en-IN"/>
-        </w:rPr>
-      </w:pPr>
-      <w:r>
-        <w:rPr>
-          <w:color w:val="000000"/>
-          <w:lang w:val="en-IN"/>
-        </w:rPr>
-        <w:t>DROP COLUMN remarks;</w:t>
-      </w:r>
-    </w:p>
-    <w:p>
-      <w:pPr>
-        <w:widowControl/>
-        <w:pBdr>
-          <w:top w:val="nil"/>
-          <w:left w:val="nil"/>
-          <w:bottom w:val="nil"/>
-          <w:right w:val="nil"/>
-          <w:between w:val="nil"/>
-        </w:pBdr>
-        <w:rPr>
-          <w:color w:val="000000"/>
-          <w:lang w:val="en-IN"/>
-        </w:rPr>
-      </w:pPr>
-      <w:r>
-        <w:rPr>
-          <w:color w:val="000000"/>
-          <w:lang w:val="en-IN"/>
-        </w:rPr>
-        <w:lastRenderedPageBreak/>
+          <w:lang w:val="en-IN"/>
+        </w:rPr>
         <w:drawing>
           <wp:inline distT="0" distB="0" distL="0" distR="0" wp14:anchorId="360EFF15" wp14:editId="13EBB19D">
             <wp:extent cx="4769095" cy="2057506"/>
@@ -3458,7 +4279,7 @@
                     <pic:cNvPicPr/>
                   </pic:nvPicPr>
                   <pic:blipFill>
-                    <a:blip r:embed="rId14"/>
+                    <a:blip r:embed="rId13"/>
                     <a:stretch>
                       <a:fillRect/>
                     </a:stretch>
@@ -3688,6 +4509,7 @@
         <w:rPr>
           <w:b/>
           <w:bCs/>
+          <w:noProof/>
           <w:sz w:val="28"/>
           <w:szCs w:val="28"/>
         </w:rPr>
@@ -3707,7 +4529,7 @@
                     <pic:cNvPicPr/>
                   </pic:nvPicPr>
                   <pic:blipFill>
-                    <a:blip r:embed="rId15"/>
+                    <a:blip r:embed="rId14"/>
                     <a:stretch>
                       <a:fillRect/>
                     </a:stretch>
@@ -3783,7 +4605,35 @@
         <w:rPr>
           <w:lang w:val="en-IN"/>
         </w:rPr>
-        <w:t>This sql query deletes the table which we created just for this querry.</w:t>
+        <w:t xml:space="preserve">This </w:t>
+      </w:r>
+      <w:proofErr w:type="spellStart"/>
+      <w:r>
+        <w:rPr>
+          <w:lang w:val="en-IN"/>
+        </w:rPr>
+        <w:t>sql</w:t>
+      </w:r>
+      <w:proofErr w:type="spellEnd"/>
+      <w:r>
+        <w:rPr>
+          <w:lang w:val="en-IN"/>
+        </w:rPr>
+        <w:t xml:space="preserve"> query deletes the table which we created just for this </w:t>
+      </w:r>
+      <w:proofErr w:type="spellStart"/>
+      <w:r>
+        <w:rPr>
+          <w:lang w:val="en-IN"/>
+        </w:rPr>
+        <w:t>querry</w:t>
+      </w:r>
+      <w:proofErr w:type="spellEnd"/>
+      <w:r>
+        <w:rPr>
+          <w:lang w:val="en-IN"/>
+        </w:rPr>
+        <w:t>.</w:t>
       </w:r>
     </w:p>
     <w:p>
@@ -3844,6 +4694,7 @@
       </w:pPr>
       <w:r>
         <w:rPr>
+          <w:noProof/>
           <w:lang w:val="en-IN"/>
         </w:rPr>
         <w:drawing>
@@ -3862,7 +4713,7 @@
                     <pic:cNvPicPr/>
                   </pic:nvPicPr>
                   <pic:blipFill>
-                    <a:blip r:embed="rId16"/>
+                    <a:blip r:embed="rId15"/>
                     <a:stretch>
                       <a:fillRect/>
                     </a:stretch>
@@ -3932,7 +4783,6 @@
           <w:sz w:val="24"/>
           <w:szCs w:val="24"/>
         </w:rPr>
-        <w:lastRenderedPageBreak/>
         <w:t>EER Diagram:</w:t>
       </w:r>
     </w:p>
@@ -3960,10 +4810,12 @@
         <w:rPr>
           <w:b/>
           <w:bCs/>
-          <w:color w:val="000000"/>
-          <w:sz w:val="24"/>
-          <w:szCs w:val="24"/>
-        </w:rPr>
+          <w:noProof/>
+          <w:color w:val="000000"/>
+          <w:sz w:val="24"/>
+          <w:szCs w:val="24"/>
+        </w:rPr>
+        <w:lastRenderedPageBreak/>
         <w:drawing>
           <wp:inline distT="0" distB="0" distL="0" distR="0" wp14:anchorId="0C41AEF2" wp14:editId="27609723">
             <wp:extent cx="5731510" cy="3580130"/>
@@ -3980,7 +4832,7 @@
                     <pic:cNvPicPr/>
                   </pic:nvPicPr>
                   <pic:blipFill>
-                    <a:blip r:embed="rId17"/>
+                    <a:blip r:embed="rId16"/>
                     <a:stretch>
                       <a:fillRect/>
                     </a:stretch>
@@ -4678,7 +5530,6 @@
                 <w:rFonts w:eastAsia="Courier New"/>
                 <w:color w:val="000000"/>
               </w:rPr>
-              <w:lastRenderedPageBreak/>
               <w:t>DROP</w:t>
             </w:r>
           </w:p>
@@ -4724,6 +5575,7 @@
               <w:rPr>
                 <w:color w:val="000000"/>
               </w:rPr>
+              <w:lastRenderedPageBreak/>
               <w:t>1. It deletes the entire table.</w:t>
             </w:r>
           </w:p>
@@ -5150,12 +6002,21 @@
           <w:lang w:val="en-IN"/>
         </w:rPr>
       </w:pPr>
-      <w:r>
-        <w:rPr>
-          <w:color w:val="000000"/>
-          <w:lang w:val="en-IN"/>
-        </w:rPr>
-        <w:t xml:space="preserve">EXAMPLE :-    </w:t>
+      <w:proofErr w:type="gramStart"/>
+      <w:r>
+        <w:rPr>
+          <w:color w:val="000000"/>
+          <w:lang w:val="en-IN"/>
+        </w:rPr>
+        <w:t>EXAMPLE :</w:t>
+      </w:r>
+      <w:proofErr w:type="gramEnd"/>
+      <w:r>
+        <w:rPr>
+          <w:color w:val="000000"/>
+          <w:lang w:val="en-IN"/>
+        </w:rPr>
+        <w:t xml:space="preserve">-    </w:t>
       </w:r>
     </w:p>
     <w:p>
@@ -6509,6 +7370,7 @@
   <w:style w:type="character" w:default="1" w:styleId="DefaultParagraphFont">
     <w:name w:val="Default Paragraph Font"/>
     <w:uiPriority w:val="1"/>
+    <w:semiHidden/>
     <w:unhideWhenUsed/>
   </w:style>
   <w:style w:type="table" w:default="1" w:styleId="TableNormal">

</xml_diff>